<commit_message>
feat: Part G SFTP clean-up task; students-only repo
- Part G: a Task Manager task (Insurligent.Task.SFTPCleanup) deletes
  PDF and text files older than 7 days from the HIS outbox. mock_his
  now also runs an SFTP server (alias his-sftp) with seeded test files.
- Lab handout: Part G, and topic call-outs for HL7 transformations
  (Part D) and scheduled tasks (Part G).
- Worksheet: core set-up only. The systems, the optional checks and
  troubleshooting move to an appendix.
- Setup deletes the Foundation production that Interop=1 makes.
- The maintainer scripts leave the repo. The README is for students.

Co-Authored-By: Claude Opus 5.5 (1M context) <noreply@anthropic.com>
</commit_message>
<xml_diff>
--- a/docs/Environment_Setup_Worksheet.docx
+++ b/docs/Environment_Setup_Worksheet.docx
@@ -1144,7 +1144,7 @@
           <w:sz w:val="21"/>
           <w:szCs w:val="21"/>
         </w:rPr>
-        <w:t xml:space="preserve">If the line does not appear, see Section 9.</w:t>
+        <w:t xml:space="preserve">If the line does not appear, see Appendix D.</w:t>
       </w:r>
     </w:p>
     <w:p>
@@ -1155,7 +1155,853 @@
         <w:rPr>
           <w:rFonts w:ascii="Calibri" w:cs="Calibri" w:eastAsia="Calibri" w:hAnsi="Calibri"/>
         </w:rPr>
-        <w:t xml:space="preserve">4. The systems</w:t>
+        <w:t xml:space="preserve">4. Set up VS Code</w:t>
+      </w:r>
+    </w:p>
+    <w:p>
+      <w:pPr>
+        <w:spacing w:after="120"/>
+      </w:pPr>
+      <w:r>
+        <w:rPr>
+          <w:rFonts w:ascii="Calibri" w:cs="Calibri" w:eastAsia="Calibri" w:hAnsi="Calibri"/>
+          <w:b/>
+          <w:bCs/>
+          <w:color w:val="333F48"/>
+          <w:sz w:val="21"/>
+          <w:szCs w:val="21"/>
+        </w:rPr>
+        <w:t xml:space="preserve">4.1 Install the extensions.</w:t>
+      </w:r>
+      <w:r>
+        <w:rPr>
+          <w:rFonts w:ascii="Calibri" w:cs="Calibri" w:eastAsia="Calibri" w:hAnsi="Calibri"/>
+          <w:color w:val="333F48"/>
+          <w:sz w:val="21"/>
+          <w:szCs w:val="21"/>
+        </w:rPr>
+        <w:t xml:space="preserve"> In VS Code, install the InterSystems ObjectScript Extension Pack. It lets you edit IRIS classes and compile them on the server.</w:t>
+      </w:r>
+    </w:p>
+    <w:p>
+      <w:pPr>
+        <w:spacing w:after="120"/>
+      </w:pPr>
+      <w:r>
+        <w:rPr>
+          <w:rFonts w:ascii="Calibri" w:cs="Calibri" w:eastAsia="Calibri" w:hAnsi="Calibri"/>
+          <w:b/>
+          <w:bCs/>
+          <w:color w:val="333F48"/>
+          <w:sz w:val="21"/>
+          <w:szCs w:val="21"/>
+        </w:rPr>
+        <w:t xml:space="preserve">4.2 Open the lab folder.</w:t>
+      </w:r>
+      <w:r>
+        <w:rPr>
+          <w:rFonts w:ascii="Calibri" w:cs="Calibri" w:eastAsia="Calibri" w:hAnsi="Calibri"/>
+          <w:color w:val="333F48"/>
+          <w:sz w:val="21"/>
+          <w:szCs w:val="21"/>
+        </w:rPr>
+        <w:t xml:space="preserve"> Click File › Open Folder and choose the </w:t>
+      </w:r>
+      <w:r>
+        <w:rPr>
+          <w:rFonts w:ascii="Consolas" w:cs="Consolas" w:eastAsia="Consolas" w:hAnsi="Consolas"/>
+          <w:color w:val="6B2C91"/>
+          <w:sz w:val="19"/>
+          <w:szCs w:val="19"/>
+        </w:rPr>
+        <w:t xml:space="preserve">Training2-D1-Lab</w:t>
+      </w:r>
+      <w:r>
+        <w:rPr>
+          <w:rFonts w:ascii="Calibri" w:cs="Calibri" w:eastAsia="Calibri" w:hAnsi="Calibri"/>
+          <w:color w:val="333F48"/>
+          <w:sz w:val="21"/>
+          <w:szCs w:val="21"/>
+        </w:rPr>
+        <w:t xml:space="preserve"> folder.</w:t>
+      </w:r>
+    </w:p>
+    <w:p>
+      <w:pPr>
+        <w:spacing w:after="120"/>
+      </w:pPr>
+      <w:r>
+        <w:rPr>
+          <w:rFonts w:ascii="Calibri" w:cs="Calibri" w:eastAsia="Calibri" w:hAnsi="Calibri"/>
+          <w:b/>
+          <w:bCs/>
+          <w:color w:val="333F48"/>
+          <w:sz w:val="21"/>
+          <w:szCs w:val="21"/>
+        </w:rPr>
+        <w:t xml:space="preserve">4.3 Connect VS Code to IRIS.</w:t>
+      </w:r>
+      <w:r>
+        <w:rPr>
+          <w:rFonts w:ascii="Calibri" w:cs="Calibri" w:eastAsia="Calibri" w:hAnsi="Calibri"/>
+          <w:color w:val="333F48"/>
+          <w:sz w:val="21"/>
+          <w:szCs w:val="21"/>
+        </w:rPr>
+        <w:t xml:space="preserve"> The folder already has the file </w:t>
+      </w:r>
+      <w:r>
+        <w:rPr>
+          <w:rFonts w:ascii="Consolas" w:cs="Consolas" w:eastAsia="Consolas" w:hAnsi="Consolas"/>
+          <w:color w:val="6B2C91"/>
+          <w:sz w:val="19"/>
+          <w:szCs w:val="19"/>
+        </w:rPr>
+        <w:t xml:space="preserve">.vscode/settings.json</w:t>
+      </w:r>
+      <w:r>
+        <w:rPr>
+          <w:rFonts w:ascii="Calibri" w:cs="Calibri" w:eastAsia="Calibri" w:hAnsi="Calibri"/>
+          <w:color w:val="333F48"/>
+          <w:sz w:val="21"/>
+          <w:szCs w:val="21"/>
+        </w:rPr>
+        <w:t xml:space="preserve">:</w:t>
+      </w:r>
+    </w:p>
+    <w:p>
+      <w:pPr>
+        <w:shd w:fill="F3F3F3" w:color="auto" w:val="clear"/>
+        <w:spacing w:after="0" w:before="80" w:line="260"/>
+        <w:ind w:left="120" w:right="120"/>
+      </w:pPr>
+      <w:r>
+        <w:rPr>
+          <w:rFonts w:ascii="Consolas" w:cs="Consolas" w:eastAsia="Consolas" w:hAnsi="Consolas"/>
+          <w:color w:val="333F48"/>
+          <w:sz w:val="18"/>
+          <w:szCs w:val="18"/>
+        </w:rPr>
+        <w:t xml:space="preserve">{</w:t>
+      </w:r>
+    </w:p>
+    <w:p>
+      <w:pPr>
+        <w:shd w:fill="F3F3F3" w:color="auto" w:val="clear"/>
+        <w:spacing w:after="0" w:before="0" w:line="260"/>
+        <w:ind w:left="120" w:right="120"/>
+      </w:pPr>
+      <w:r>
+        <w:rPr>
+          <w:rFonts w:ascii="Consolas" w:cs="Consolas" w:eastAsia="Consolas" w:hAnsi="Consolas"/>
+          <w:color w:val="333F48"/>
+          <w:sz w:val="18"/>
+          <w:szCs w:val="18"/>
+        </w:rPr>
+        <w:t xml:space="preserve">  "intersystems.servers": {</w:t>
+      </w:r>
+    </w:p>
+    <w:p>
+      <w:pPr>
+        <w:shd w:fill="F3F3F3" w:color="auto" w:val="clear"/>
+        <w:spacing w:after="0" w:before="0" w:line="260"/>
+        <w:ind w:left="120" w:right="120"/>
+      </w:pPr>
+      <w:r>
+        <w:rPr>
+          <w:rFonts w:ascii="Consolas" w:cs="Consolas" w:eastAsia="Consolas" w:hAnsi="Consolas"/>
+          <w:color w:val="333F48"/>
+          <w:sz w:val="18"/>
+          <w:szCs w:val="18"/>
+        </w:rPr>
+        <w:t xml:space="preserve">    "insurligent": {</w:t>
+      </w:r>
+    </w:p>
+    <w:p>
+      <w:pPr>
+        <w:shd w:fill="F3F3F3" w:color="auto" w:val="clear"/>
+        <w:spacing w:after="0" w:before="0" w:line="260"/>
+        <w:ind w:left="120" w:right="120"/>
+      </w:pPr>
+      <w:r>
+        <w:rPr>
+          <w:rFonts w:ascii="Consolas" w:cs="Consolas" w:eastAsia="Consolas" w:hAnsi="Consolas"/>
+          <w:color w:val="333F48"/>
+          <w:sz w:val="18"/>
+          <w:szCs w:val="18"/>
+        </w:rPr>
+        <w:t xml:space="preserve">      "webServer": { "host": "localhost", "port": 52773 },</w:t>
+      </w:r>
+    </w:p>
+    <w:p>
+      <w:pPr>
+        <w:shd w:fill="F3F3F3" w:color="auto" w:val="clear"/>
+        <w:spacing w:after="0" w:before="0" w:line="260"/>
+        <w:ind w:left="120" w:right="120"/>
+      </w:pPr>
+      <w:r>
+        <w:rPr>
+          <w:rFonts w:ascii="Consolas" w:cs="Consolas" w:eastAsia="Consolas" w:hAnsi="Consolas"/>
+          <w:color w:val="333F48"/>
+          <w:sz w:val="18"/>
+          <w:szCs w:val="18"/>
+        </w:rPr>
+        <w:t xml:space="preserve">      "username": "_SYSTEM"</w:t>
+      </w:r>
+    </w:p>
+    <w:p>
+      <w:pPr>
+        <w:shd w:fill="F3F3F3" w:color="auto" w:val="clear"/>
+        <w:spacing w:after="0" w:before="0" w:line="260"/>
+        <w:ind w:left="120" w:right="120"/>
+      </w:pPr>
+      <w:r>
+        <w:rPr>
+          <w:rFonts w:ascii="Consolas" w:cs="Consolas" w:eastAsia="Consolas" w:hAnsi="Consolas"/>
+          <w:color w:val="333F48"/>
+          <w:sz w:val="18"/>
+          <w:szCs w:val="18"/>
+        </w:rPr>
+        <w:t xml:space="preserve">    }</w:t>
+      </w:r>
+    </w:p>
+    <w:p>
+      <w:pPr>
+        <w:shd w:fill="F3F3F3" w:color="auto" w:val="clear"/>
+        <w:spacing w:after="0" w:before="0" w:line="260"/>
+        <w:ind w:left="120" w:right="120"/>
+      </w:pPr>
+      <w:r>
+        <w:rPr>
+          <w:rFonts w:ascii="Consolas" w:cs="Consolas" w:eastAsia="Consolas" w:hAnsi="Consolas"/>
+          <w:color w:val="333F48"/>
+          <w:sz w:val="18"/>
+          <w:szCs w:val="18"/>
+        </w:rPr>
+        <w:t xml:space="preserve">  },</w:t>
+      </w:r>
+    </w:p>
+    <w:p>
+      <w:pPr>
+        <w:shd w:fill="F3F3F3" w:color="auto" w:val="clear"/>
+        <w:spacing w:after="0" w:before="0" w:line="260"/>
+        <w:ind w:left="120" w:right="120"/>
+      </w:pPr>
+      <w:r>
+        <w:rPr>
+          <w:rFonts w:ascii="Consolas" w:cs="Consolas" w:eastAsia="Consolas" w:hAnsi="Consolas"/>
+          <w:color w:val="333F48"/>
+          <w:sz w:val="18"/>
+          <w:szCs w:val="18"/>
+        </w:rPr>
+        <w:t xml:space="preserve">  "objectscript.conn": { "server": "insurligent", "ns": "INSURLIGENT", "active": true }</w:t>
+      </w:r>
+    </w:p>
+    <w:p>
+      <w:pPr>
+        <w:shd w:fill="F3F3F3" w:color="auto" w:val="clear"/>
+        <w:spacing w:after="160" w:before="0" w:line="260"/>
+        <w:ind w:left="120" w:right="120"/>
+      </w:pPr>
+      <w:r>
+        <w:rPr>
+          <w:rFonts w:ascii="Consolas" w:cs="Consolas" w:eastAsia="Consolas" w:hAnsi="Consolas"/>
+          <w:color w:val="333F48"/>
+          <w:sz w:val="18"/>
+          <w:szCs w:val="18"/>
+        </w:rPr>
+        <w:t xml:space="preserve">}</w:t>
+      </w:r>
+    </w:p>
+    <w:p>
+      <w:pPr>
+        <w:spacing w:after="120"/>
+      </w:pPr>
+      <w:r>
+        <w:rPr>
+          <w:rFonts w:ascii="Calibri" w:cs="Calibri" w:eastAsia="Calibri" w:hAnsi="Calibri"/>
+          <w:color w:val="333F48"/>
+          <w:sz w:val="21"/>
+          <w:szCs w:val="21"/>
+        </w:rPr>
+        <w:t xml:space="preserve">When VS Code asks for a password, enter </w:t>
+      </w:r>
+      <w:r>
+        <w:rPr>
+          <w:rFonts w:ascii="Consolas" w:cs="Consolas" w:eastAsia="Consolas" w:hAnsi="Consolas"/>
+          <w:color w:val="6B2C91"/>
+          <w:sz w:val="19"/>
+          <w:szCs w:val="19"/>
+        </w:rPr>
+        <w:t xml:space="preserve">SYS</w:t>
+      </w:r>
+      <w:r>
+        <w:rPr>
+          <w:rFonts w:ascii="Calibri" w:cs="Calibri" w:eastAsia="Calibri" w:hAnsi="Calibri"/>
+          <w:color w:val="333F48"/>
+          <w:sz w:val="21"/>
+          <w:szCs w:val="21"/>
+        </w:rPr>
+        <w:t xml:space="preserve">.</w:t>
+      </w:r>
+    </w:p>
+    <w:p>
+      <w:pPr>
+        <w:spacing w:after="120"/>
+      </w:pPr>
+      <w:r>
+        <w:rPr>
+          <w:rFonts w:ascii="Calibri" w:cs="Calibri" w:eastAsia="Calibri" w:hAnsi="Calibri"/>
+          <w:b/>
+          <w:bCs/>
+          <w:color w:val="333F48"/>
+          <w:sz w:val="21"/>
+          <w:szCs w:val="21"/>
+        </w:rPr>
+        <w:t xml:space="preserve">4.4 Check the connection.</w:t>
+      </w:r>
+      <w:r>
+        <w:rPr>
+          <w:rFonts w:ascii="Calibri" w:cs="Calibri" w:eastAsia="Calibri" w:hAnsi="Calibri"/>
+          <w:color w:val="333F48"/>
+          <w:sz w:val="21"/>
+          <w:szCs w:val="21"/>
+        </w:rPr>
+        <w:t xml:space="preserve"> Click the InterSystems icon in the Activity Bar, then the Explorer view. It shows the classes in </w:t>
+      </w:r>
+      <w:r>
+        <w:rPr>
+          <w:rFonts w:ascii="Consolas" w:cs="Consolas" w:eastAsia="Consolas" w:hAnsi="Consolas"/>
+          <w:color w:val="6B2C91"/>
+          <w:sz w:val="19"/>
+          <w:szCs w:val="19"/>
+        </w:rPr>
+        <w:t xml:space="preserve">INSURLIGENT</w:t>
+      </w:r>
+      <w:r>
+        <w:rPr>
+          <w:rFonts w:ascii="Calibri" w:cs="Calibri" w:eastAsia="Calibri" w:hAnsi="Calibri"/>
+          <w:color w:val="333F48"/>
+          <w:sz w:val="21"/>
+          <w:szCs w:val="21"/>
+        </w:rPr>
+        <w:t xml:space="preserve"> on the server. You should see the </w:t>
+      </w:r>
+      <w:r>
+        <w:rPr>
+          <w:rFonts w:ascii="Consolas" w:cs="Consolas" w:eastAsia="Consolas" w:hAnsi="Consolas"/>
+          <w:color w:val="6B2C91"/>
+          <w:sz w:val="19"/>
+          <w:szCs w:val="19"/>
+        </w:rPr>
+        <w:t xml:space="preserve">Insurligent</w:t>
+      </w:r>
+      <w:r>
+        <w:rPr>
+          <w:rFonts w:ascii="Calibri" w:cs="Calibri" w:eastAsia="Calibri" w:hAnsi="Calibri"/>
+          <w:color w:val="333F48"/>
+          <w:sz w:val="21"/>
+          <w:szCs w:val="21"/>
+        </w:rPr>
+        <w:t xml:space="preserve"> package with one class, </w:t>
+      </w:r>
+      <w:r>
+        <w:rPr>
+          <w:rFonts w:ascii="Consolas" w:cs="Consolas" w:eastAsia="Consolas" w:hAnsi="Consolas"/>
+          <w:color w:val="6B2C91"/>
+          <w:sz w:val="19"/>
+          <w:szCs w:val="19"/>
+        </w:rPr>
+        <w:t xml:space="preserve">Insurligent.Setup</w:t>
+      </w:r>
+      <w:r>
+        <w:rPr>
+          <w:rFonts w:ascii="Calibri" w:cs="Calibri" w:eastAsia="Calibri" w:hAnsi="Calibri"/>
+          <w:color w:val="333F48"/>
+          <w:sz w:val="21"/>
+          <w:szCs w:val="21"/>
+        </w:rPr>
+        <w:t xml:space="preserve">.</w:t>
+      </w:r>
+    </w:p>
+    <w:p>
+      <w:pPr>
+        <w:spacing w:after="120"/>
+      </w:pPr>
+      <w:r>
+        <w:rPr>
+          <w:rFonts w:ascii="Calibri" w:cs="Calibri" w:eastAsia="Calibri" w:hAnsi="Calibri"/>
+          <w:b/>
+          <w:bCs/>
+          <w:color w:val="333F48"/>
+          <w:sz w:val="21"/>
+          <w:szCs w:val="21"/>
+        </w:rPr>
+        <w:t xml:space="preserve">4.5 Look at the folders.</w:t>
+      </w:r>
+      <w:r>
+        <w:rPr>
+          <w:rFonts w:ascii="Calibri" w:cs="Calibri" w:eastAsia="Calibri" w:hAnsi="Calibri"/>
+          <w:color w:val="333F48"/>
+          <w:sz w:val="21"/>
+          <w:szCs w:val="21"/>
+        </w:rPr>
+        <w:t xml:space="preserve"> In the Explorer of VS Code, open </w:t>
+      </w:r>
+      <w:r>
+        <w:rPr>
+          <w:rFonts w:ascii="Consolas" w:cs="Consolas" w:eastAsia="Consolas" w:hAnsi="Consolas"/>
+          <w:color w:val="6B2C91"/>
+          <w:sz w:val="19"/>
+          <w:szCs w:val="19"/>
+        </w:rPr>
+        <w:t xml:space="preserve">src/Insurligent</w:t>
+      </w:r>
+      <w:r>
+        <w:rPr>
+          <w:rFonts w:ascii="Calibri" w:cs="Calibri" w:eastAsia="Calibri" w:hAnsi="Calibri"/>
+          <w:color w:val="333F48"/>
+          <w:sz w:val="21"/>
+          <w:szCs w:val="21"/>
+        </w:rPr>
+        <w:t xml:space="preserve">. It has an empty folder for each package that you write in the lab, for example </w:t>
+      </w:r>
+      <w:r>
+        <w:rPr>
+          <w:rFonts w:ascii="Consolas" w:cs="Consolas" w:eastAsia="Consolas" w:hAnsi="Consolas"/>
+          <w:color w:val="6B2C91"/>
+          <w:sz w:val="19"/>
+          <w:szCs w:val="19"/>
+        </w:rPr>
+        <w:t xml:space="preserve">Interop/BO</w:t>
+      </w:r>
+      <w:r>
+        <w:rPr>
+          <w:rFonts w:ascii="Calibri" w:cs="Calibri" w:eastAsia="Calibri" w:hAnsi="Calibri"/>
+          <w:color w:val="333F48"/>
+          <w:sz w:val="21"/>
+          <w:szCs w:val="21"/>
+        </w:rPr>
+        <w:t xml:space="preserve"> and </w:t>
+      </w:r>
+      <w:r>
+        <w:rPr>
+          <w:rFonts w:ascii="Consolas" w:cs="Consolas" w:eastAsia="Consolas" w:hAnsi="Consolas"/>
+          <w:color w:val="6B2C91"/>
+          <w:sz w:val="19"/>
+          <w:szCs w:val="19"/>
+        </w:rPr>
+        <w:t xml:space="preserve">Interop/MSG/Insurer</w:t>
+      </w:r>
+      <w:r>
+        <w:rPr>
+          <w:rFonts w:ascii="Calibri" w:cs="Calibri" w:eastAsia="Calibri" w:hAnsi="Calibri"/>
+          <w:color w:val="333F48"/>
+          <w:sz w:val="21"/>
+          <w:szCs w:val="21"/>
+        </w:rPr>
+        <w:t xml:space="preserve">.</w:t>
+      </w:r>
+    </w:p>
+    <w:p>
+      <w:pPr>
+        <w:pStyle w:val="Heading1"/>
+      </w:pPr>
+      <w:r>
+        <w:rPr>
+          <w:rFonts w:ascii="Calibri" w:cs="Calibri" w:eastAsia="Calibri" w:hAnsi="Calibri"/>
+        </w:rPr>
+        <w:t xml:space="preserve">5. Stop and start</w:t>
+      </w:r>
+    </w:p>
+    <w:p>
+      <w:pPr>
+        <w:spacing w:after="120"/>
+      </w:pPr>
+      <w:r>
+        <w:rPr>
+          <w:rFonts w:ascii="Calibri" w:cs="Calibri" w:eastAsia="Calibri" w:hAnsi="Calibri"/>
+          <w:color w:val="333F48"/>
+          <w:sz w:val="21"/>
+          <w:szCs w:val="21"/>
+        </w:rPr>
+        <w:t xml:space="preserve">Stop the containers when you finish. Give IRIS time to shut down cleanly:</w:t>
+      </w:r>
+    </w:p>
+    <w:p>
+      <w:pPr>
+        <w:shd w:fill="F3F3F3" w:color="auto" w:val="clear"/>
+        <w:spacing w:after="160" w:before="80" w:line="260"/>
+        <w:ind w:left="120" w:right="120"/>
+      </w:pPr>
+      <w:r>
+        <w:rPr>
+          <w:rFonts w:ascii="Consolas" w:cs="Consolas" w:eastAsia="Consolas" w:hAnsi="Consolas"/>
+          <w:color w:val="333F48"/>
+          <w:sz w:val="18"/>
+          <w:szCs w:val="18"/>
+        </w:rPr>
+        <w:t xml:space="preserve">docker compose down -t 60</w:t>
+      </w:r>
+    </w:p>
+    <w:p>
+      <w:pPr>
+        <w:spacing w:after="120"/>
+      </w:pPr>
+      <w:r>
+        <w:rPr>
+          <w:rFonts w:ascii="Calibri" w:cs="Calibri" w:eastAsia="Calibri" w:hAnsi="Calibri"/>
+          <w:color w:val="333F48"/>
+          <w:sz w:val="21"/>
+          <w:szCs w:val="21"/>
+        </w:rPr>
+        <w:t xml:space="preserve">Start them again. IRIS keeps your work:</w:t>
+      </w:r>
+    </w:p>
+    <w:p>
+      <w:pPr>
+        <w:shd w:fill="F3F3F3" w:color="auto" w:val="clear"/>
+        <w:spacing w:after="160" w:before="80" w:line="260"/>
+        <w:ind w:left="120" w:right="120"/>
+      </w:pPr>
+      <w:r>
+        <w:rPr>
+          <w:rFonts w:ascii="Consolas" w:cs="Consolas" w:eastAsia="Consolas" w:hAnsi="Consolas"/>
+          <w:color w:val="333F48"/>
+          <w:sz w:val="18"/>
+          <w:szCs w:val="18"/>
+        </w:rPr>
+        <w:t xml:space="preserve">docker compose up -d</w:t>
+      </w:r>
+    </w:p>
+    <w:p>
+      <w:pPr>
+        <w:spacing w:after="120"/>
+      </w:pPr>
+      <w:r>
+        <w:rPr>
+          <w:rFonts w:ascii="Calibri" w:cs="Calibri" w:eastAsia="Calibri" w:hAnsi="Calibri"/>
+          <w:color w:val="333F48"/>
+          <w:sz w:val="21"/>
+          <w:szCs w:val="21"/>
+        </w:rPr>
+        <w:t xml:space="preserve">On the day of the lab, start them before the class starts.</w:t>
+      </w:r>
+    </w:p>
+    <w:p>
+      <w:pPr>
+        <w:pStyle w:val="Heading1"/>
+      </w:pPr>
+      <w:r>
+        <w:rPr>
+          <w:rFonts w:ascii="Calibri" w:cs="Calibri" w:eastAsia="Calibri" w:hAnsi="Calibri"/>
+        </w:rPr>
+        <w:t xml:space="preserve">6. Checklist</w:t>
+      </w:r>
+    </w:p>
+    <w:p>
+      <w:pPr>
+        <w:spacing w:after="120"/>
+      </w:pPr>
+      <w:r>
+        <w:rPr>
+          <w:rFonts w:ascii="Calibri" w:cs="Calibri" w:eastAsia="Calibri" w:hAnsi="Calibri"/>
+          <w:color w:val="333F48"/>
+          <w:sz w:val="21"/>
+          <w:szCs w:val="21"/>
+        </w:rPr>
+        <w:t xml:space="preserve">Tick each line. Bring this to the lab.</w:t>
+      </w:r>
+    </w:p>
+    <w:tbl>
+      <w:tblPr>
+        <w:tblW w:type="dxa" w:w="9638"/>
+        <w:tblBorders>
+          <w:top w:val="single" w:color="auto" w:sz="4"/>
+          <w:left w:val="single" w:color="auto" w:sz="4"/>
+          <w:bottom w:val="single" w:color="auto" w:sz="4"/>
+          <w:right w:val="single" w:color="auto" w:sz="4"/>
+          <w:insideH w:val="single" w:color="auto" w:sz="4"/>
+          <w:insideV w:val="single" w:color="auto" w:sz="4"/>
+        </w:tblBorders>
+        <w:tblLayout w:type="fixed"/>
+      </w:tblPr>
+      <w:tblGrid>
+        <w:gridCol w:w="900"/>
+        <w:gridCol w:w="8738"/>
+      </w:tblGrid>
+      <w:tr>
+        <w:trPr>
+          <w:tblHeader/>
+        </w:trPr>
+        <w:tc>
+          <w:tcPr>
+            <w:tcW w:type="dxa" w:w="900"/>
+            <w:tcBorders>
+              <w:top w:val="single" w:color="C9D1D6" w:sz="4"/>
+              <w:left w:val="single" w:color="C9D1D6" w:sz="4"/>
+              <w:bottom w:val="single" w:color="C9D1D6" w:sz="4"/>
+              <w:right w:val="single" w:color="C9D1D6" w:sz="4"/>
+            </w:tcBorders>
+            <w:shd w:fill="00A99D" w:color="auto" w:val="clear"/>
+            <w:tcMar>
+              <w:top w:type="dxa" w:w="60"/>
+              <w:left w:type="dxa" w:w="100"/>
+              <w:bottom w:type="dxa" w:w="60"/>
+              <w:right w:type="dxa" w:w="100"/>
+            </w:tcMar>
+          </w:tcPr>
+          <w:p>
+            <w:r>
+              <w:rPr>
+                <w:rFonts w:ascii="Calibri" w:cs="Calibri" w:eastAsia="Calibri" w:hAnsi="Calibri"/>
+                <w:b/>
+                <w:bCs/>
+                <w:color w:val="FFFFFF"/>
+                <w:sz w:val="19"/>
+                <w:szCs w:val="19"/>
+              </w:rPr>
+              <w:t xml:space="preserve">Done</w:t>
+            </w:r>
+          </w:p>
+        </w:tc>
+        <w:tc>
+          <w:tcPr>
+            <w:tcW w:type="dxa" w:w="8738"/>
+            <w:tcBorders>
+              <w:top w:val="single" w:color="C9D1D6" w:sz="4"/>
+              <w:left w:val="single" w:color="C9D1D6" w:sz="4"/>
+              <w:bottom w:val="single" w:color="C9D1D6" w:sz="4"/>
+              <w:right w:val="single" w:color="C9D1D6" w:sz="4"/>
+            </w:tcBorders>
+            <w:shd w:fill="00A99D" w:color="auto" w:val="clear"/>
+            <w:tcMar>
+              <w:top w:type="dxa" w:w="60"/>
+              <w:left w:type="dxa" w:w="100"/>
+              <w:bottom w:type="dxa" w:w="60"/>
+              <w:right w:type="dxa" w:w="100"/>
+            </w:tcMar>
+          </w:tcPr>
+          <w:p>
+            <w:r>
+              <w:rPr>
+                <w:rFonts w:ascii="Calibri" w:cs="Calibri" w:eastAsia="Calibri" w:hAnsi="Calibri"/>
+                <w:b/>
+                <w:bCs/>
+                <w:color w:val="FFFFFF"/>
+                <w:sz w:val="19"/>
+                <w:szCs w:val="19"/>
+              </w:rPr>
+              <w:t xml:space="preserve">Check</w:t>
+            </w:r>
+          </w:p>
+        </w:tc>
+      </w:tr>
+      <w:tr>
+        <w:trPr>
+          <w:tblHeader w:val="false"/>
+        </w:trPr>
+        <w:tc>
+          <w:tcPr>
+            <w:tcW w:type="dxa" w:w="900"/>
+            <w:tcBorders>
+              <w:top w:val="single" w:color="C9D1D6" w:sz="4"/>
+              <w:left w:val="single" w:color="C9D1D6" w:sz="4"/>
+              <w:bottom w:val="single" w:color="C9D1D6" w:sz="4"/>
+              <w:right w:val="single" w:color="C9D1D6" w:sz="4"/>
+            </w:tcBorders>
+            <w:shd w:fill="FFFFFF" w:color="auto" w:val="clear"/>
+            <w:tcMar>
+              <w:top w:type="dxa" w:w="60"/>
+              <w:left w:type="dxa" w:w="100"/>
+              <w:bottom w:type="dxa" w:w="60"/>
+              <w:right w:type="dxa" w:w="100"/>
+            </w:tcMar>
+          </w:tcPr>
+          <w:p>
+            <w:r>
+              <w:rPr>
+                <w:rFonts w:ascii="Calibri" w:cs="Calibri" w:eastAsia="Calibri" w:hAnsi="Calibri"/>
+                <w:color w:val="333F48"/>
+                <w:sz w:val="19"/>
+                <w:szCs w:val="19"/>
+              </w:rPr>
+              <w:t xml:space="preserve">☐</w:t>
+            </w:r>
+          </w:p>
+        </w:tc>
+        <w:tc>
+          <w:tcPr>
+            <w:tcW w:type="dxa" w:w="8738"/>
+            <w:tcBorders>
+              <w:top w:val="single" w:color="C9D1D6" w:sz="4"/>
+              <w:left w:val="single" w:color="C9D1D6" w:sz="4"/>
+              <w:bottom w:val="single" w:color="C9D1D6" w:sz="4"/>
+              <w:right w:val="single" w:color="C9D1D6" w:sz="4"/>
+            </w:tcBorders>
+            <w:shd w:fill="FFFFFF" w:color="auto" w:val="clear"/>
+            <w:tcMar>
+              <w:top w:type="dxa" w:w="60"/>
+              <w:left w:type="dxa" w:w="100"/>
+              <w:bottom w:type="dxa" w:w="60"/>
+              <w:right w:type="dxa" w:w="100"/>
+            </w:tcMar>
+          </w:tcPr>
+          <w:p>
+            <w:r>
+              <w:rPr>
+                <w:rFonts w:ascii="Calibri" w:cs="Calibri" w:eastAsia="Calibri" w:hAnsi="Calibri"/>
+                <w:color w:val="333F48"/>
+                <w:sz w:val="19"/>
+                <w:szCs w:val="19"/>
+              </w:rPr>
+              <w:t xml:space="preserve">The log shows </w:t>
+            </w:r>
+            <w:r>
+              <w:rPr>
+                <w:rFonts w:ascii="Consolas" w:cs="Consolas" w:eastAsia="Consolas" w:hAnsi="Consolas"/>
+                <w:color w:val="6B2C91"/>
+                <w:sz w:val="17"/>
+                <w:szCs w:val="17"/>
+              </w:rPr>
+              <w:t xml:space="preserve">[insurligent-setup] complete.</w:t>
+            </w:r>
+          </w:p>
+        </w:tc>
+      </w:tr>
+      <w:tr>
+        <w:trPr>
+          <w:tblHeader w:val="false"/>
+        </w:trPr>
+        <w:tc>
+          <w:tcPr>
+            <w:tcW w:type="dxa" w:w="900"/>
+            <w:tcBorders>
+              <w:top w:val="single" w:color="C9D1D6" w:sz="4"/>
+              <w:left w:val="single" w:color="C9D1D6" w:sz="4"/>
+              <w:bottom w:val="single" w:color="C9D1D6" w:sz="4"/>
+              <w:right w:val="single" w:color="C9D1D6" w:sz="4"/>
+            </w:tcBorders>
+            <w:shd w:fill="F1F4F6" w:color="auto" w:val="clear"/>
+            <w:tcMar>
+              <w:top w:type="dxa" w:w="60"/>
+              <w:left w:type="dxa" w:w="100"/>
+              <w:bottom w:type="dxa" w:w="60"/>
+              <w:right w:type="dxa" w:w="100"/>
+            </w:tcMar>
+          </w:tcPr>
+          <w:p>
+            <w:r>
+              <w:rPr>
+                <w:rFonts w:ascii="Calibri" w:cs="Calibri" w:eastAsia="Calibri" w:hAnsi="Calibri"/>
+                <w:color w:val="333F48"/>
+                <w:sz w:val="19"/>
+                <w:szCs w:val="19"/>
+              </w:rPr>
+              <w:t xml:space="preserve">☐</w:t>
+            </w:r>
+          </w:p>
+        </w:tc>
+        <w:tc>
+          <w:tcPr>
+            <w:tcW w:type="dxa" w:w="8738"/>
+            <w:tcBorders>
+              <w:top w:val="single" w:color="C9D1D6" w:sz="4"/>
+              <w:left w:val="single" w:color="C9D1D6" w:sz="4"/>
+              <w:bottom w:val="single" w:color="C9D1D6" w:sz="4"/>
+              <w:right w:val="single" w:color="C9D1D6" w:sz="4"/>
+            </w:tcBorders>
+            <w:shd w:fill="F1F4F6" w:color="auto" w:val="clear"/>
+            <w:tcMar>
+              <w:top w:type="dxa" w:w="60"/>
+              <w:left w:type="dxa" w:w="100"/>
+              <w:bottom w:type="dxa" w:w="60"/>
+              <w:right w:type="dxa" w:w="100"/>
+            </w:tcMar>
+          </w:tcPr>
+          <w:p>
+            <w:r>
+              <w:rPr>
+                <w:rFonts w:ascii="Calibri" w:cs="Calibri" w:eastAsia="Calibri" w:hAnsi="Calibri"/>
+                <w:color w:val="333F48"/>
+                <w:sz w:val="19"/>
+                <w:szCs w:val="19"/>
+              </w:rPr>
+              <w:t xml:space="preserve">VS Code shows </w:t>
+            </w:r>
+            <w:r>
+              <w:rPr>
+                <w:rFonts w:ascii="Consolas" w:cs="Consolas" w:eastAsia="Consolas" w:hAnsi="Consolas"/>
+                <w:color w:val="6B2C91"/>
+                <w:sz w:val="17"/>
+                <w:szCs w:val="17"/>
+              </w:rPr>
+              <w:t xml:space="preserve">Insurligent.Setup</w:t>
+            </w:r>
+            <w:r>
+              <w:rPr>
+                <w:rFonts w:ascii="Calibri" w:cs="Calibri" w:eastAsia="Calibri" w:hAnsi="Calibri"/>
+                <w:color w:val="333F48"/>
+                <w:sz w:val="19"/>
+                <w:szCs w:val="19"/>
+              </w:rPr>
+              <w:t xml:space="preserve"> in the InterSystems Explorer view, and the empty folders under </w:t>
+            </w:r>
+            <w:r>
+              <w:rPr>
+                <w:rFonts w:ascii="Consolas" w:cs="Consolas" w:eastAsia="Consolas" w:hAnsi="Consolas"/>
+                <w:color w:val="6B2C91"/>
+                <w:sz w:val="17"/>
+                <w:szCs w:val="17"/>
+              </w:rPr>
+              <w:t xml:space="preserve">src/Insurligent</w:t>
+            </w:r>
+            <w:r>
+              <w:rPr>
+                <w:rFonts w:ascii="Calibri" w:cs="Calibri" w:eastAsia="Calibri" w:hAnsi="Calibri"/>
+                <w:color w:val="333F48"/>
+                <w:sz w:val="19"/>
+                <w:szCs w:val="19"/>
+              </w:rPr>
+              <w:t xml:space="preserve">.</w:t>
+            </w:r>
+          </w:p>
+        </w:tc>
+      </w:tr>
+    </w:tbl>
+    <w:p>
+      <w:pPr>
+        <w:spacing w:after="60"/>
+      </w:pPr>
+    </w:p>
+    <w:p>
+      <w:r>
+        <w:br w:type="page"/>
+      </w:r>
+    </w:p>
+    <w:p>
+      <w:pPr>
+        <w:spacing w:after="120"/>
+      </w:pPr>
+      <w:r>
+        <w:rPr>
+          <w:rFonts w:ascii="Calibri" w:cs="Calibri" w:eastAsia="Calibri" w:hAnsi="Calibri"/>
+          <w:color w:val="333F48"/>
+          <w:sz w:val="21"/>
+          <w:szCs w:val="21"/>
+        </w:rPr>
+        <w:t xml:space="preserve">The appendixes give more information about the environment. Appendixes B and C are checks that you can do if you want to know more, or if you have a problem.</w:t>
+      </w:r>
+    </w:p>
+    <w:p>
+      <w:pPr>
+        <w:pStyle w:val="Heading1"/>
+      </w:pPr>
+      <w:r>
+        <w:rPr>
+          <w:rFonts w:ascii="Calibri" w:cs="Calibri" w:eastAsia="Calibri" w:hAnsi="Calibri"/>
+        </w:rPr>
+        <w:t xml:space="preserve">Appendix A. The systems</w:t>
       </w:r>
     </w:p>
     <w:p>
@@ -1506,7 +2352,7 @@
                 <w:sz w:val="19"/>
                 <w:szCs w:val="19"/>
               </w:rPr>
-              <w:t xml:space="preserve">Test hospital system (HIS). It answers HL7 queries such as PAT-01, over MLLP.</w:t>
+              <w:t xml:space="preserve">Test hospital system (HIS). It answers HL7 queries such as PAT-01, over MLLP. It also has an SFTP server with test files for Part G of the lab.</w:t>
             </w:r>
           </w:p>
         </w:tc>
@@ -1535,7 +2381,7 @@
                 <w:sz w:val="19"/>
                 <w:szCs w:val="19"/>
               </w:rPr>
-              <w:t xml:space="preserve">2575</w:t>
+              <w:t xml:space="preserve">2575 (SFTP: only inside Docker)</w:t>
             </w:r>
           </w:p>
         </w:tc>
@@ -1746,7 +2592,7 @@
         <w:rPr>
           <w:rFonts w:ascii="Calibri" w:cs="Calibri" w:eastAsia="Calibri" w:hAnsi="Calibri"/>
         </w:rPr>
-        <w:t xml:space="preserve">5. Check IRIS</w:t>
+        <w:t xml:space="preserve">Appendix B. Check IRIS</w:t>
       </w:r>
     </w:p>
     <w:p>
@@ -1762,7 +2608,7 @@
           <w:sz w:val="21"/>
           <w:szCs w:val="21"/>
         </w:rPr>
-        <w:t xml:space="preserve">5.1 Open the Management Portal.</w:t>
+        <w:t xml:space="preserve">B.1 Open the Management Portal.</w:t>
       </w:r>
       <w:r>
         <w:rPr>
@@ -1841,7 +2687,7 @@
           <w:sz w:val="21"/>
           <w:szCs w:val="21"/>
         </w:rPr>
-        <w:t xml:space="preserve">5.2 Check the namespace.</w:t>
+        <w:t xml:space="preserve">B.2 Check the namespace.</w:t>
       </w:r>
       <w:r>
         <w:rPr>
@@ -1884,7 +2730,7 @@
           <w:sz w:val="21"/>
           <w:szCs w:val="21"/>
         </w:rPr>
-        <w:t xml:space="preserve">5.3 Check interoperability.</w:t>
+        <w:t xml:space="preserve">B.3 Check interoperability.</w:t>
       </w:r>
       <w:r>
         <w:rPr>
@@ -1922,7 +2768,7 @@
         <w:rPr>
           <w:rFonts w:ascii="Calibri" w:cs="Calibri" w:eastAsia="Calibri" w:hAnsi="Calibri"/>
         </w:rPr>
-        <w:t xml:space="preserve">6. Check the test systems</w:t>
+        <w:t xml:space="preserve">Appendix C. Check the test systems</w:t>
       </w:r>
     </w:p>
     <w:p>
@@ -1938,7 +2784,7 @@
           <w:sz w:val="21"/>
           <w:szCs w:val="21"/>
         </w:rPr>
-        <w:t xml:space="preserve">6.1 Run the self-test of each mock.</w:t>
+        <w:t xml:space="preserve">C.1 Run the self-test of each mock.</w:t>
       </w:r>
     </w:p>
     <w:p>
@@ -2032,7 +2878,7 @@
           <w:sz w:val="21"/>
           <w:szCs w:val="21"/>
         </w:rPr>
-        <w:t xml:space="preserve">6.2 Call the insurer directly.</w:t>
+        <w:t xml:space="preserve">C.2 Call the insurer directly.</w:t>
       </w:r>
       <w:r>
         <w:rPr>
@@ -2136,548 +2982,7 @@
         <w:rPr>
           <w:rFonts w:ascii="Calibri" w:cs="Calibri" w:eastAsia="Calibri" w:hAnsi="Calibri"/>
         </w:rPr>
-        <w:t xml:space="preserve">7. Set up VS Code</w:t>
-      </w:r>
-    </w:p>
-    <w:p>
-      <w:pPr>
-        <w:spacing w:after="120"/>
-      </w:pPr>
-      <w:r>
-        <w:rPr>
-          <w:rFonts w:ascii="Calibri" w:cs="Calibri" w:eastAsia="Calibri" w:hAnsi="Calibri"/>
-          <w:b/>
-          <w:bCs/>
-          <w:color w:val="333F48"/>
-          <w:sz w:val="21"/>
-          <w:szCs w:val="21"/>
-        </w:rPr>
-        <w:t xml:space="preserve">7.1 Install the extensions.</w:t>
-      </w:r>
-      <w:r>
-        <w:rPr>
-          <w:rFonts w:ascii="Calibri" w:cs="Calibri" w:eastAsia="Calibri" w:hAnsi="Calibri"/>
-          <w:color w:val="333F48"/>
-          <w:sz w:val="21"/>
-          <w:szCs w:val="21"/>
-        </w:rPr>
-        <w:t xml:space="preserve"> In VS Code, install the InterSystems ObjectScript Extension Pack. It lets you edit IRIS classes and compile them on the server.</w:t>
-      </w:r>
-    </w:p>
-    <w:p>
-      <w:pPr>
-        <w:spacing w:after="120"/>
-      </w:pPr>
-      <w:r>
-        <w:rPr>
-          <w:rFonts w:ascii="Calibri" w:cs="Calibri" w:eastAsia="Calibri" w:hAnsi="Calibri"/>
-          <w:b/>
-          <w:bCs/>
-          <w:color w:val="333F48"/>
-          <w:sz w:val="21"/>
-          <w:szCs w:val="21"/>
-        </w:rPr>
-        <w:t xml:space="preserve">7.2 Open the lab folder.</w:t>
-      </w:r>
-      <w:r>
-        <w:rPr>
-          <w:rFonts w:ascii="Calibri" w:cs="Calibri" w:eastAsia="Calibri" w:hAnsi="Calibri"/>
-          <w:color w:val="333F48"/>
-          <w:sz w:val="21"/>
-          <w:szCs w:val="21"/>
-        </w:rPr>
-        <w:t xml:space="preserve"> Click File › Open Folder and choose the </w:t>
-      </w:r>
-      <w:r>
-        <w:rPr>
-          <w:rFonts w:ascii="Consolas" w:cs="Consolas" w:eastAsia="Consolas" w:hAnsi="Consolas"/>
-          <w:color w:val="6B2C91"/>
-          <w:sz w:val="19"/>
-          <w:szCs w:val="19"/>
-        </w:rPr>
-        <w:t xml:space="preserve">Training2-D1-Lab</w:t>
-      </w:r>
-      <w:r>
-        <w:rPr>
-          <w:rFonts w:ascii="Calibri" w:cs="Calibri" w:eastAsia="Calibri" w:hAnsi="Calibri"/>
-          <w:color w:val="333F48"/>
-          <w:sz w:val="21"/>
-          <w:szCs w:val="21"/>
-        </w:rPr>
-        <w:t xml:space="preserve"> folder.</w:t>
-      </w:r>
-    </w:p>
-    <w:p>
-      <w:pPr>
-        <w:spacing w:after="120"/>
-      </w:pPr>
-      <w:r>
-        <w:rPr>
-          <w:rFonts w:ascii="Calibri" w:cs="Calibri" w:eastAsia="Calibri" w:hAnsi="Calibri"/>
-          <w:b/>
-          <w:bCs/>
-          <w:color w:val="333F48"/>
-          <w:sz w:val="21"/>
-          <w:szCs w:val="21"/>
-        </w:rPr>
-        <w:t xml:space="preserve">7.3 Connect VS Code to IRIS.</w:t>
-      </w:r>
-      <w:r>
-        <w:rPr>
-          <w:rFonts w:ascii="Calibri" w:cs="Calibri" w:eastAsia="Calibri" w:hAnsi="Calibri"/>
-          <w:color w:val="333F48"/>
-          <w:sz w:val="21"/>
-          <w:szCs w:val="21"/>
-        </w:rPr>
-        <w:t xml:space="preserve"> The folder already has the file </w:t>
-      </w:r>
-      <w:r>
-        <w:rPr>
-          <w:rFonts w:ascii="Consolas" w:cs="Consolas" w:eastAsia="Consolas" w:hAnsi="Consolas"/>
-          <w:color w:val="6B2C91"/>
-          <w:sz w:val="19"/>
-          <w:szCs w:val="19"/>
-        </w:rPr>
-        <w:t xml:space="preserve">.vscode/settings.json</w:t>
-      </w:r>
-      <w:r>
-        <w:rPr>
-          <w:rFonts w:ascii="Calibri" w:cs="Calibri" w:eastAsia="Calibri" w:hAnsi="Calibri"/>
-          <w:color w:val="333F48"/>
-          <w:sz w:val="21"/>
-          <w:szCs w:val="21"/>
-        </w:rPr>
-        <w:t xml:space="preserve">:</w:t>
-      </w:r>
-    </w:p>
-    <w:p>
-      <w:pPr>
-        <w:shd w:fill="F3F3F3" w:color="auto" w:val="clear"/>
-        <w:spacing w:after="0" w:before="80" w:line="260"/>
-        <w:ind w:left="120" w:right="120"/>
-      </w:pPr>
-      <w:r>
-        <w:rPr>
-          <w:rFonts w:ascii="Consolas" w:cs="Consolas" w:eastAsia="Consolas" w:hAnsi="Consolas"/>
-          <w:color w:val="333F48"/>
-          <w:sz w:val="18"/>
-          <w:szCs w:val="18"/>
-        </w:rPr>
-        <w:t xml:space="preserve">{</w:t>
-      </w:r>
-    </w:p>
-    <w:p>
-      <w:pPr>
-        <w:shd w:fill="F3F3F3" w:color="auto" w:val="clear"/>
-        <w:spacing w:after="0" w:before="0" w:line="260"/>
-        <w:ind w:left="120" w:right="120"/>
-      </w:pPr>
-      <w:r>
-        <w:rPr>
-          <w:rFonts w:ascii="Consolas" w:cs="Consolas" w:eastAsia="Consolas" w:hAnsi="Consolas"/>
-          <w:color w:val="333F48"/>
-          <w:sz w:val="18"/>
-          <w:szCs w:val="18"/>
-        </w:rPr>
-        <w:t xml:space="preserve">  "intersystems.servers": {</w:t>
-      </w:r>
-    </w:p>
-    <w:p>
-      <w:pPr>
-        <w:shd w:fill="F3F3F3" w:color="auto" w:val="clear"/>
-        <w:spacing w:after="0" w:before="0" w:line="260"/>
-        <w:ind w:left="120" w:right="120"/>
-      </w:pPr>
-      <w:r>
-        <w:rPr>
-          <w:rFonts w:ascii="Consolas" w:cs="Consolas" w:eastAsia="Consolas" w:hAnsi="Consolas"/>
-          <w:color w:val="333F48"/>
-          <w:sz w:val="18"/>
-          <w:szCs w:val="18"/>
-        </w:rPr>
-        <w:t xml:space="preserve">    "insurligent": {</w:t>
-      </w:r>
-    </w:p>
-    <w:p>
-      <w:pPr>
-        <w:shd w:fill="F3F3F3" w:color="auto" w:val="clear"/>
-        <w:spacing w:after="0" w:before="0" w:line="260"/>
-        <w:ind w:left="120" w:right="120"/>
-      </w:pPr>
-      <w:r>
-        <w:rPr>
-          <w:rFonts w:ascii="Consolas" w:cs="Consolas" w:eastAsia="Consolas" w:hAnsi="Consolas"/>
-          <w:color w:val="333F48"/>
-          <w:sz w:val="18"/>
-          <w:szCs w:val="18"/>
-        </w:rPr>
-        <w:t xml:space="preserve">      "webServer": { "host": "localhost", "port": 52773 },</w:t>
-      </w:r>
-    </w:p>
-    <w:p>
-      <w:pPr>
-        <w:shd w:fill="F3F3F3" w:color="auto" w:val="clear"/>
-        <w:spacing w:after="0" w:before="0" w:line="260"/>
-        <w:ind w:left="120" w:right="120"/>
-      </w:pPr>
-      <w:r>
-        <w:rPr>
-          <w:rFonts w:ascii="Consolas" w:cs="Consolas" w:eastAsia="Consolas" w:hAnsi="Consolas"/>
-          <w:color w:val="333F48"/>
-          <w:sz w:val="18"/>
-          <w:szCs w:val="18"/>
-        </w:rPr>
-        <w:t xml:space="preserve">      "username": "_SYSTEM"</w:t>
-      </w:r>
-    </w:p>
-    <w:p>
-      <w:pPr>
-        <w:shd w:fill="F3F3F3" w:color="auto" w:val="clear"/>
-        <w:spacing w:after="0" w:before="0" w:line="260"/>
-        <w:ind w:left="120" w:right="120"/>
-      </w:pPr>
-      <w:r>
-        <w:rPr>
-          <w:rFonts w:ascii="Consolas" w:cs="Consolas" w:eastAsia="Consolas" w:hAnsi="Consolas"/>
-          <w:color w:val="333F48"/>
-          <w:sz w:val="18"/>
-          <w:szCs w:val="18"/>
-        </w:rPr>
-        <w:t xml:space="preserve">    }</w:t>
-      </w:r>
-    </w:p>
-    <w:p>
-      <w:pPr>
-        <w:shd w:fill="F3F3F3" w:color="auto" w:val="clear"/>
-        <w:spacing w:after="0" w:before="0" w:line="260"/>
-        <w:ind w:left="120" w:right="120"/>
-      </w:pPr>
-      <w:r>
-        <w:rPr>
-          <w:rFonts w:ascii="Consolas" w:cs="Consolas" w:eastAsia="Consolas" w:hAnsi="Consolas"/>
-          <w:color w:val="333F48"/>
-          <w:sz w:val="18"/>
-          <w:szCs w:val="18"/>
-        </w:rPr>
-        <w:t xml:space="preserve">  },</w:t>
-      </w:r>
-    </w:p>
-    <w:p>
-      <w:pPr>
-        <w:shd w:fill="F3F3F3" w:color="auto" w:val="clear"/>
-        <w:spacing w:after="0" w:before="0" w:line="260"/>
-        <w:ind w:left="120" w:right="120"/>
-      </w:pPr>
-      <w:r>
-        <w:rPr>
-          <w:rFonts w:ascii="Consolas" w:cs="Consolas" w:eastAsia="Consolas" w:hAnsi="Consolas"/>
-          <w:color w:val="333F48"/>
-          <w:sz w:val="18"/>
-          <w:szCs w:val="18"/>
-        </w:rPr>
-        <w:t xml:space="preserve">  "objectscript.conn": { "server": "insurligent", "ns": "INSURLIGENT", "active": true }</w:t>
-      </w:r>
-    </w:p>
-    <w:p>
-      <w:pPr>
-        <w:shd w:fill="F3F3F3" w:color="auto" w:val="clear"/>
-        <w:spacing w:after="160" w:before="0" w:line="260"/>
-        <w:ind w:left="120" w:right="120"/>
-      </w:pPr>
-      <w:r>
-        <w:rPr>
-          <w:rFonts w:ascii="Consolas" w:cs="Consolas" w:eastAsia="Consolas" w:hAnsi="Consolas"/>
-          <w:color w:val="333F48"/>
-          <w:sz w:val="18"/>
-          <w:szCs w:val="18"/>
-        </w:rPr>
-        <w:t xml:space="preserve">}</w:t>
-      </w:r>
-    </w:p>
-    <w:p>
-      <w:pPr>
-        <w:spacing w:after="120"/>
-      </w:pPr>
-      <w:r>
-        <w:rPr>
-          <w:rFonts w:ascii="Calibri" w:cs="Calibri" w:eastAsia="Calibri" w:hAnsi="Calibri"/>
-          <w:color w:val="333F48"/>
-          <w:sz w:val="21"/>
-          <w:szCs w:val="21"/>
-        </w:rPr>
-        <w:t xml:space="preserve">When VS Code asks for a password, enter </w:t>
-      </w:r>
-      <w:r>
-        <w:rPr>
-          <w:rFonts w:ascii="Consolas" w:cs="Consolas" w:eastAsia="Consolas" w:hAnsi="Consolas"/>
-          <w:color w:val="6B2C91"/>
-          <w:sz w:val="19"/>
-          <w:szCs w:val="19"/>
-        </w:rPr>
-        <w:t xml:space="preserve">SYS</w:t>
-      </w:r>
-      <w:r>
-        <w:rPr>
-          <w:rFonts w:ascii="Calibri" w:cs="Calibri" w:eastAsia="Calibri" w:hAnsi="Calibri"/>
-          <w:color w:val="333F48"/>
-          <w:sz w:val="21"/>
-          <w:szCs w:val="21"/>
-        </w:rPr>
-        <w:t xml:space="preserve">.</w:t>
-      </w:r>
-    </w:p>
-    <w:p>
-      <w:pPr>
-        <w:spacing w:after="120"/>
-      </w:pPr>
-      <w:r>
-        <w:rPr>
-          <w:rFonts w:ascii="Calibri" w:cs="Calibri" w:eastAsia="Calibri" w:hAnsi="Calibri"/>
-          <w:b/>
-          <w:bCs/>
-          <w:color w:val="333F48"/>
-          <w:sz w:val="21"/>
-          <w:szCs w:val="21"/>
-        </w:rPr>
-        <w:t xml:space="preserve">7.4 Check the connection.</w:t>
-      </w:r>
-      <w:r>
-        <w:rPr>
-          <w:rFonts w:ascii="Calibri" w:cs="Calibri" w:eastAsia="Calibri" w:hAnsi="Calibri"/>
-          <w:color w:val="333F48"/>
-          <w:sz w:val="21"/>
-          <w:szCs w:val="21"/>
-        </w:rPr>
-        <w:t xml:space="preserve"> Click the InterSystems icon in the Activity Bar, then the Explorer view. It shows the classes in </w:t>
-      </w:r>
-      <w:r>
-        <w:rPr>
-          <w:rFonts w:ascii="Consolas" w:cs="Consolas" w:eastAsia="Consolas" w:hAnsi="Consolas"/>
-          <w:color w:val="6B2C91"/>
-          <w:sz w:val="19"/>
-          <w:szCs w:val="19"/>
-        </w:rPr>
-        <w:t xml:space="preserve">INSURLIGENT</w:t>
-      </w:r>
-      <w:r>
-        <w:rPr>
-          <w:rFonts w:ascii="Calibri" w:cs="Calibri" w:eastAsia="Calibri" w:hAnsi="Calibri"/>
-          <w:color w:val="333F48"/>
-          <w:sz w:val="21"/>
-          <w:szCs w:val="21"/>
-        </w:rPr>
-        <w:t xml:space="preserve"> on the server. You should see the </w:t>
-      </w:r>
-      <w:r>
-        <w:rPr>
-          <w:rFonts w:ascii="Consolas" w:cs="Consolas" w:eastAsia="Consolas" w:hAnsi="Consolas"/>
-          <w:color w:val="6B2C91"/>
-          <w:sz w:val="19"/>
-          <w:szCs w:val="19"/>
-        </w:rPr>
-        <w:t xml:space="preserve">Insurligent</w:t>
-      </w:r>
-      <w:r>
-        <w:rPr>
-          <w:rFonts w:ascii="Calibri" w:cs="Calibri" w:eastAsia="Calibri" w:hAnsi="Calibri"/>
-          <w:color w:val="333F48"/>
-          <w:sz w:val="21"/>
-          <w:szCs w:val="21"/>
-        </w:rPr>
-        <w:t xml:space="preserve"> package with one class, </w:t>
-      </w:r>
-      <w:r>
-        <w:rPr>
-          <w:rFonts w:ascii="Consolas" w:cs="Consolas" w:eastAsia="Consolas" w:hAnsi="Consolas"/>
-          <w:color w:val="6B2C91"/>
-          <w:sz w:val="19"/>
-          <w:szCs w:val="19"/>
-        </w:rPr>
-        <w:t xml:space="preserve">Insurligent.Setup</w:t>
-      </w:r>
-      <w:r>
-        <w:rPr>
-          <w:rFonts w:ascii="Calibri" w:cs="Calibri" w:eastAsia="Calibri" w:hAnsi="Calibri"/>
-          <w:color w:val="333F48"/>
-          <w:sz w:val="21"/>
-          <w:szCs w:val="21"/>
-        </w:rPr>
-        <w:t xml:space="preserve">.</w:t>
-      </w:r>
-    </w:p>
-    <w:p>
-      <w:pPr>
-        <w:spacing w:after="120"/>
-      </w:pPr>
-      <w:r>
-        <w:rPr>
-          <w:rFonts w:ascii="Calibri" w:cs="Calibri" w:eastAsia="Calibri" w:hAnsi="Calibri"/>
-          <w:b/>
-          <w:bCs/>
-          <w:color w:val="333F48"/>
-          <w:sz w:val="21"/>
-          <w:szCs w:val="21"/>
-        </w:rPr>
-        <w:t xml:space="preserve">7.5 Look at the folders.</w:t>
-      </w:r>
-      <w:r>
-        <w:rPr>
-          <w:rFonts w:ascii="Calibri" w:cs="Calibri" w:eastAsia="Calibri" w:hAnsi="Calibri"/>
-          <w:color w:val="333F48"/>
-          <w:sz w:val="21"/>
-          <w:szCs w:val="21"/>
-        </w:rPr>
-        <w:t xml:space="preserve"> In the Explorer of VS Code, open </w:t>
-      </w:r>
-      <w:r>
-        <w:rPr>
-          <w:rFonts w:ascii="Consolas" w:cs="Consolas" w:eastAsia="Consolas" w:hAnsi="Consolas"/>
-          <w:color w:val="6B2C91"/>
-          <w:sz w:val="19"/>
-          <w:szCs w:val="19"/>
-        </w:rPr>
-        <w:t xml:space="preserve">src/Insurligent</w:t>
-      </w:r>
-      <w:r>
-        <w:rPr>
-          <w:rFonts w:ascii="Calibri" w:cs="Calibri" w:eastAsia="Calibri" w:hAnsi="Calibri"/>
-          <w:color w:val="333F48"/>
-          <w:sz w:val="21"/>
-          <w:szCs w:val="21"/>
-        </w:rPr>
-        <w:t xml:space="preserve">. It has an empty folder for each package that you write in the lab, for example </w:t>
-      </w:r>
-      <w:r>
-        <w:rPr>
-          <w:rFonts w:ascii="Consolas" w:cs="Consolas" w:eastAsia="Consolas" w:hAnsi="Consolas"/>
-          <w:color w:val="6B2C91"/>
-          <w:sz w:val="19"/>
-          <w:szCs w:val="19"/>
-        </w:rPr>
-        <w:t xml:space="preserve">Interop/BO</w:t>
-      </w:r>
-      <w:r>
-        <w:rPr>
-          <w:rFonts w:ascii="Calibri" w:cs="Calibri" w:eastAsia="Calibri" w:hAnsi="Calibri"/>
-          <w:color w:val="333F48"/>
-          <w:sz w:val="21"/>
-          <w:szCs w:val="21"/>
-        </w:rPr>
-        <w:t xml:space="preserve"> and </w:t>
-      </w:r>
-      <w:r>
-        <w:rPr>
-          <w:rFonts w:ascii="Consolas" w:cs="Consolas" w:eastAsia="Consolas" w:hAnsi="Consolas"/>
-          <w:color w:val="6B2C91"/>
-          <w:sz w:val="19"/>
-          <w:szCs w:val="19"/>
-        </w:rPr>
-        <w:t xml:space="preserve">Interop/MSG/Insurer</w:t>
-      </w:r>
-      <w:r>
-        <w:rPr>
-          <w:rFonts w:ascii="Calibri" w:cs="Calibri" w:eastAsia="Calibri" w:hAnsi="Calibri"/>
-          <w:color w:val="333F48"/>
-          <w:sz w:val="21"/>
-          <w:szCs w:val="21"/>
-        </w:rPr>
-        <w:t xml:space="preserve">.</w:t>
-      </w:r>
-    </w:p>
-    <w:p>
-      <w:pPr>
-        <w:pStyle w:val="Heading1"/>
-      </w:pPr>
-      <w:r>
-        <w:rPr>
-          <w:rFonts w:ascii="Calibri" w:cs="Calibri" w:eastAsia="Calibri" w:hAnsi="Calibri"/>
-        </w:rPr>
-        <w:t xml:space="preserve">8. Stop and start</w:t>
-      </w:r>
-    </w:p>
-    <w:p>
-      <w:pPr>
-        <w:spacing w:after="120"/>
-      </w:pPr>
-      <w:r>
-        <w:rPr>
-          <w:rFonts w:ascii="Calibri" w:cs="Calibri" w:eastAsia="Calibri" w:hAnsi="Calibri"/>
-          <w:color w:val="333F48"/>
-          <w:sz w:val="21"/>
-          <w:szCs w:val="21"/>
-        </w:rPr>
-        <w:t xml:space="preserve">Stop the containers when you finish. Give IRIS time to shut down cleanly:</w:t>
-      </w:r>
-    </w:p>
-    <w:p>
-      <w:pPr>
-        <w:shd w:fill="F3F3F3" w:color="auto" w:val="clear"/>
-        <w:spacing w:after="160" w:before="80" w:line="260"/>
-        <w:ind w:left="120" w:right="120"/>
-      </w:pPr>
-      <w:r>
-        <w:rPr>
-          <w:rFonts w:ascii="Consolas" w:cs="Consolas" w:eastAsia="Consolas" w:hAnsi="Consolas"/>
-          <w:color w:val="333F48"/>
-          <w:sz w:val="18"/>
-          <w:szCs w:val="18"/>
-        </w:rPr>
-        <w:t xml:space="preserve">docker compose down -t 60</w:t>
-      </w:r>
-    </w:p>
-    <w:p>
-      <w:pPr>
-        <w:spacing w:after="120"/>
-      </w:pPr>
-      <w:r>
-        <w:rPr>
-          <w:rFonts w:ascii="Calibri" w:cs="Calibri" w:eastAsia="Calibri" w:hAnsi="Calibri"/>
-          <w:color w:val="333F48"/>
-          <w:sz w:val="21"/>
-          <w:szCs w:val="21"/>
-        </w:rPr>
-        <w:t xml:space="preserve">Start them again. IRIS keeps your work:</w:t>
-      </w:r>
-    </w:p>
-    <w:p>
-      <w:pPr>
-        <w:shd w:fill="F3F3F3" w:color="auto" w:val="clear"/>
-        <w:spacing w:after="160" w:before="80" w:line="260"/>
-        <w:ind w:left="120" w:right="120"/>
-      </w:pPr>
-      <w:r>
-        <w:rPr>
-          <w:rFonts w:ascii="Consolas" w:cs="Consolas" w:eastAsia="Consolas" w:hAnsi="Consolas"/>
-          <w:color w:val="333F48"/>
-          <w:sz w:val="18"/>
-          <w:szCs w:val="18"/>
-        </w:rPr>
-        <w:t xml:space="preserve">docker compose up -d</w:t>
-      </w:r>
-    </w:p>
-    <w:p>
-      <w:pPr>
-        <w:spacing w:after="120"/>
-      </w:pPr>
-      <w:r>
-        <w:rPr>
-          <w:rFonts w:ascii="Calibri" w:cs="Calibri" w:eastAsia="Calibri" w:hAnsi="Calibri"/>
-          <w:color w:val="333F48"/>
-          <w:sz w:val="21"/>
-          <w:szCs w:val="21"/>
-        </w:rPr>
-        <w:t xml:space="preserve">On the day of the lab, start them before the class starts.</w:t>
-      </w:r>
-    </w:p>
-    <w:p>
-      <w:pPr>
-        <w:pStyle w:val="Heading1"/>
-      </w:pPr>
-      <w:r>
-        <w:rPr>
-          <w:rFonts w:ascii="Calibri" w:cs="Calibri" w:eastAsia="Calibri" w:hAnsi="Calibri"/>
-        </w:rPr>
-        <w:t xml:space="preserve">9. If something goes wrong</w:t>
+        <w:t xml:space="preserve">Appendix D. If something goes wrong</w:t>
       </w:r>
     </w:p>
     <w:tbl>
@@ -3210,508 +3515,6 @@
                 <w:szCs w:val="19"/>
               </w:rPr>
               <w:t xml:space="preserve">Write down the step and the error, and tell your instructor.</w:t>
-            </w:r>
-          </w:p>
-        </w:tc>
-      </w:tr>
-    </w:tbl>
-    <w:p>
-      <w:pPr>
-        <w:spacing w:after="60"/>
-      </w:pPr>
-    </w:p>
-    <w:p>
-      <w:pPr>
-        <w:pStyle w:val="Heading1"/>
-      </w:pPr>
-      <w:r>
-        <w:rPr>
-          <w:rFonts w:ascii="Calibri" w:cs="Calibri" w:eastAsia="Calibri" w:hAnsi="Calibri"/>
-        </w:rPr>
-        <w:t xml:space="preserve">10. Checklist</w:t>
-      </w:r>
-    </w:p>
-    <w:p>
-      <w:pPr>
-        <w:spacing w:after="120"/>
-      </w:pPr>
-      <w:r>
-        <w:rPr>
-          <w:rFonts w:ascii="Calibri" w:cs="Calibri" w:eastAsia="Calibri" w:hAnsi="Calibri"/>
-          <w:color w:val="333F48"/>
-          <w:sz w:val="21"/>
-          <w:szCs w:val="21"/>
-        </w:rPr>
-        <w:t xml:space="preserve">Tick each line. Bring this to the lab.</w:t>
-      </w:r>
-    </w:p>
-    <w:tbl>
-      <w:tblPr>
-        <w:tblW w:type="dxa" w:w="9638"/>
-        <w:tblBorders>
-          <w:top w:val="single" w:color="auto" w:sz="4"/>
-          <w:left w:val="single" w:color="auto" w:sz="4"/>
-          <w:bottom w:val="single" w:color="auto" w:sz="4"/>
-          <w:right w:val="single" w:color="auto" w:sz="4"/>
-          <w:insideH w:val="single" w:color="auto" w:sz="4"/>
-          <w:insideV w:val="single" w:color="auto" w:sz="4"/>
-        </w:tblBorders>
-        <w:tblLayout w:type="fixed"/>
-      </w:tblPr>
-      <w:tblGrid>
-        <w:gridCol w:w="900"/>
-        <w:gridCol w:w="8738"/>
-      </w:tblGrid>
-      <w:tr>
-        <w:trPr>
-          <w:tblHeader/>
-        </w:trPr>
-        <w:tc>
-          <w:tcPr>
-            <w:tcW w:type="dxa" w:w="900"/>
-            <w:tcBorders>
-              <w:top w:val="single" w:color="C9D1D6" w:sz="4"/>
-              <w:left w:val="single" w:color="C9D1D6" w:sz="4"/>
-              <w:bottom w:val="single" w:color="C9D1D6" w:sz="4"/>
-              <w:right w:val="single" w:color="C9D1D6" w:sz="4"/>
-            </w:tcBorders>
-            <w:shd w:fill="00A99D" w:color="auto" w:val="clear"/>
-            <w:tcMar>
-              <w:top w:type="dxa" w:w="60"/>
-              <w:left w:type="dxa" w:w="100"/>
-              <w:bottom w:type="dxa" w:w="60"/>
-              <w:right w:type="dxa" w:w="100"/>
-            </w:tcMar>
-          </w:tcPr>
-          <w:p>
-            <w:r>
-              <w:rPr>
-                <w:rFonts w:ascii="Calibri" w:cs="Calibri" w:eastAsia="Calibri" w:hAnsi="Calibri"/>
-                <w:b/>
-                <w:bCs/>
-                <w:color w:val="FFFFFF"/>
-                <w:sz w:val="19"/>
-                <w:szCs w:val="19"/>
-              </w:rPr>
-              <w:t xml:space="preserve">Done</w:t>
-            </w:r>
-          </w:p>
-        </w:tc>
-        <w:tc>
-          <w:tcPr>
-            <w:tcW w:type="dxa" w:w="8738"/>
-            <w:tcBorders>
-              <w:top w:val="single" w:color="C9D1D6" w:sz="4"/>
-              <w:left w:val="single" w:color="C9D1D6" w:sz="4"/>
-              <w:bottom w:val="single" w:color="C9D1D6" w:sz="4"/>
-              <w:right w:val="single" w:color="C9D1D6" w:sz="4"/>
-            </w:tcBorders>
-            <w:shd w:fill="00A99D" w:color="auto" w:val="clear"/>
-            <w:tcMar>
-              <w:top w:type="dxa" w:w="60"/>
-              <w:left w:type="dxa" w:w="100"/>
-              <w:bottom w:type="dxa" w:w="60"/>
-              <w:right w:type="dxa" w:w="100"/>
-            </w:tcMar>
-          </w:tcPr>
-          <w:p>
-            <w:r>
-              <w:rPr>
-                <w:rFonts w:ascii="Calibri" w:cs="Calibri" w:eastAsia="Calibri" w:hAnsi="Calibri"/>
-                <w:b/>
-                <w:bCs/>
-                <w:color w:val="FFFFFF"/>
-                <w:sz w:val="19"/>
-                <w:szCs w:val="19"/>
-              </w:rPr>
-              <w:t xml:space="preserve">Check</w:t>
-            </w:r>
-          </w:p>
-        </w:tc>
-      </w:tr>
-      <w:tr>
-        <w:trPr>
-          <w:tblHeader w:val="false"/>
-        </w:trPr>
-        <w:tc>
-          <w:tcPr>
-            <w:tcW w:type="dxa" w:w="900"/>
-            <w:tcBorders>
-              <w:top w:val="single" w:color="C9D1D6" w:sz="4"/>
-              <w:left w:val="single" w:color="C9D1D6" w:sz="4"/>
-              <w:bottom w:val="single" w:color="C9D1D6" w:sz="4"/>
-              <w:right w:val="single" w:color="C9D1D6" w:sz="4"/>
-            </w:tcBorders>
-            <w:shd w:fill="FFFFFF" w:color="auto" w:val="clear"/>
-            <w:tcMar>
-              <w:top w:type="dxa" w:w="60"/>
-              <w:left w:type="dxa" w:w="100"/>
-              <w:bottom w:type="dxa" w:w="60"/>
-              <w:right w:type="dxa" w:w="100"/>
-            </w:tcMar>
-          </w:tcPr>
-          <w:p>
-            <w:r>
-              <w:rPr>
-                <w:rFonts w:ascii="Calibri" w:cs="Calibri" w:eastAsia="Calibri" w:hAnsi="Calibri"/>
-                <w:color w:val="333F48"/>
-                <w:sz w:val="19"/>
-                <w:szCs w:val="19"/>
-              </w:rPr>
-              <w:t xml:space="preserve">☐</w:t>
-            </w:r>
-          </w:p>
-        </w:tc>
-        <w:tc>
-          <w:tcPr>
-            <w:tcW w:type="dxa" w:w="8738"/>
-            <w:tcBorders>
-              <w:top w:val="single" w:color="C9D1D6" w:sz="4"/>
-              <w:left w:val="single" w:color="C9D1D6" w:sz="4"/>
-              <w:bottom w:val="single" w:color="C9D1D6" w:sz="4"/>
-              <w:right w:val="single" w:color="C9D1D6" w:sz="4"/>
-            </w:tcBorders>
-            <w:shd w:fill="FFFFFF" w:color="auto" w:val="clear"/>
-            <w:tcMar>
-              <w:top w:type="dxa" w:w="60"/>
-              <w:left w:type="dxa" w:w="100"/>
-              <w:bottom w:type="dxa" w:w="60"/>
-              <w:right w:type="dxa" w:w="100"/>
-            </w:tcMar>
-          </w:tcPr>
-          <w:p>
-            <w:r>
-              <w:rPr>
-                <w:rFonts w:ascii="Calibri" w:cs="Calibri" w:eastAsia="Calibri" w:hAnsi="Calibri"/>
-                <w:color w:val="333F48"/>
-                <w:sz w:val="19"/>
-                <w:szCs w:val="19"/>
-              </w:rPr>
-              <w:t xml:space="preserve">The log shows </w:t>
-            </w:r>
-            <w:r>
-              <w:rPr>
-                <w:rFonts w:ascii="Consolas" w:cs="Consolas" w:eastAsia="Consolas" w:hAnsi="Consolas"/>
-                <w:color w:val="6B2C91"/>
-                <w:sz w:val="17"/>
-                <w:szCs w:val="17"/>
-              </w:rPr>
-              <w:t xml:space="preserve">[insurligent-setup] complete.</w:t>
-            </w:r>
-          </w:p>
-        </w:tc>
-      </w:tr>
-      <w:tr>
-        <w:trPr>
-          <w:tblHeader w:val="false"/>
-        </w:trPr>
-        <w:tc>
-          <w:tcPr>
-            <w:tcW w:type="dxa" w:w="900"/>
-            <w:tcBorders>
-              <w:top w:val="single" w:color="C9D1D6" w:sz="4"/>
-              <w:left w:val="single" w:color="C9D1D6" w:sz="4"/>
-              <w:bottom w:val="single" w:color="C9D1D6" w:sz="4"/>
-              <w:right w:val="single" w:color="C9D1D6" w:sz="4"/>
-            </w:tcBorders>
-            <w:shd w:fill="F1F4F6" w:color="auto" w:val="clear"/>
-            <w:tcMar>
-              <w:top w:type="dxa" w:w="60"/>
-              <w:left w:type="dxa" w:w="100"/>
-              <w:bottom w:type="dxa" w:w="60"/>
-              <w:right w:type="dxa" w:w="100"/>
-            </w:tcMar>
-          </w:tcPr>
-          <w:p>
-            <w:r>
-              <w:rPr>
-                <w:rFonts w:ascii="Calibri" w:cs="Calibri" w:eastAsia="Calibri" w:hAnsi="Calibri"/>
-                <w:color w:val="333F48"/>
-                <w:sz w:val="19"/>
-                <w:szCs w:val="19"/>
-              </w:rPr>
-              <w:t xml:space="preserve">☐</w:t>
-            </w:r>
-          </w:p>
-        </w:tc>
-        <w:tc>
-          <w:tcPr>
-            <w:tcW w:type="dxa" w:w="8738"/>
-            <w:tcBorders>
-              <w:top w:val="single" w:color="C9D1D6" w:sz="4"/>
-              <w:left w:val="single" w:color="C9D1D6" w:sz="4"/>
-              <w:bottom w:val="single" w:color="C9D1D6" w:sz="4"/>
-              <w:right w:val="single" w:color="C9D1D6" w:sz="4"/>
-            </w:tcBorders>
-            <w:shd w:fill="F1F4F6" w:color="auto" w:val="clear"/>
-            <w:tcMar>
-              <w:top w:type="dxa" w:w="60"/>
-              <w:left w:type="dxa" w:w="100"/>
-              <w:bottom w:type="dxa" w:w="60"/>
-              <w:right w:type="dxa" w:w="100"/>
-            </w:tcMar>
-          </w:tcPr>
-          <w:p>
-            <w:r>
-              <w:rPr>
-                <w:rFonts w:ascii="Calibri" w:cs="Calibri" w:eastAsia="Calibri" w:hAnsi="Calibri"/>
-                <w:color w:val="333F48"/>
-                <w:sz w:val="19"/>
-                <w:szCs w:val="19"/>
-              </w:rPr>
-              <w:t xml:space="preserve">I can log in to the Management Portal as </w:t>
-            </w:r>
-            <w:r>
-              <w:rPr>
-                <w:rFonts w:ascii="Consolas" w:cs="Consolas" w:eastAsia="Consolas" w:hAnsi="Consolas"/>
-                <w:color w:val="6B2C91"/>
-                <w:sz w:val="17"/>
-                <w:szCs w:val="17"/>
-              </w:rPr>
-              <w:t xml:space="preserve">_SYSTEM</w:t>
-            </w:r>
-            <w:r>
-              <w:rPr>
-                <w:rFonts w:ascii="Calibri" w:cs="Calibri" w:eastAsia="Calibri" w:hAnsi="Calibri"/>
-                <w:color w:val="333F48"/>
-                <w:sz w:val="19"/>
-                <w:szCs w:val="19"/>
-              </w:rPr>
-              <w:t xml:space="preserve">.</w:t>
-            </w:r>
-          </w:p>
-        </w:tc>
-      </w:tr>
-      <w:tr>
-        <w:trPr>
-          <w:tblHeader w:val="false"/>
-        </w:trPr>
-        <w:tc>
-          <w:tcPr>
-            <w:tcW w:type="dxa" w:w="900"/>
-            <w:tcBorders>
-              <w:top w:val="single" w:color="C9D1D6" w:sz="4"/>
-              <w:left w:val="single" w:color="C9D1D6" w:sz="4"/>
-              <w:bottom w:val="single" w:color="C9D1D6" w:sz="4"/>
-              <w:right w:val="single" w:color="C9D1D6" w:sz="4"/>
-            </w:tcBorders>
-            <w:shd w:fill="FFFFFF" w:color="auto" w:val="clear"/>
-            <w:tcMar>
-              <w:top w:type="dxa" w:w="60"/>
-              <w:left w:type="dxa" w:w="100"/>
-              <w:bottom w:type="dxa" w:w="60"/>
-              <w:right w:type="dxa" w:w="100"/>
-            </w:tcMar>
-          </w:tcPr>
-          <w:p>
-            <w:r>
-              <w:rPr>
-                <w:rFonts w:ascii="Calibri" w:cs="Calibri" w:eastAsia="Calibri" w:hAnsi="Calibri"/>
-                <w:color w:val="333F48"/>
-                <w:sz w:val="19"/>
-                <w:szCs w:val="19"/>
-              </w:rPr>
-              <w:t xml:space="preserve">☐</w:t>
-            </w:r>
-          </w:p>
-        </w:tc>
-        <w:tc>
-          <w:tcPr>
-            <w:tcW w:type="dxa" w:w="8738"/>
-            <w:tcBorders>
-              <w:top w:val="single" w:color="C9D1D6" w:sz="4"/>
-              <w:left w:val="single" w:color="C9D1D6" w:sz="4"/>
-              <w:bottom w:val="single" w:color="C9D1D6" w:sz="4"/>
-              <w:right w:val="single" w:color="C9D1D6" w:sz="4"/>
-            </w:tcBorders>
-            <w:shd w:fill="FFFFFF" w:color="auto" w:val="clear"/>
-            <w:tcMar>
-              <w:top w:type="dxa" w:w="60"/>
-              <w:left w:type="dxa" w:w="100"/>
-              <w:bottom w:type="dxa" w:w="60"/>
-              <w:right w:type="dxa" w:w="100"/>
-            </w:tcMar>
-          </w:tcPr>
-          <w:p>
-            <w:r>
-              <w:rPr>
-                <w:rFonts w:ascii="Consolas" w:cs="Consolas" w:eastAsia="Consolas" w:hAnsi="Consolas"/>
-                <w:color w:val="6B2C91"/>
-                <w:sz w:val="17"/>
-                <w:szCs w:val="17"/>
-              </w:rPr>
-              <w:t xml:space="preserve">INSURLIGENT</w:t>
-            </w:r>
-            <w:r>
-              <w:rPr>
-                <w:rFonts w:ascii="Calibri" w:cs="Calibri" w:eastAsia="Calibri" w:hAnsi="Calibri"/>
-                <w:color w:val="333F48"/>
-                <w:sz w:val="19"/>
-                <w:szCs w:val="19"/>
-              </w:rPr>
-              <w:t xml:space="preserve"> exists, and its Interoperability menu opens.</w:t>
-            </w:r>
-          </w:p>
-        </w:tc>
-      </w:tr>
-      <w:tr>
-        <w:trPr>
-          <w:tblHeader w:val="false"/>
-        </w:trPr>
-        <w:tc>
-          <w:tcPr>
-            <w:tcW w:type="dxa" w:w="900"/>
-            <w:tcBorders>
-              <w:top w:val="single" w:color="C9D1D6" w:sz="4"/>
-              <w:left w:val="single" w:color="C9D1D6" w:sz="4"/>
-              <w:bottom w:val="single" w:color="C9D1D6" w:sz="4"/>
-              <w:right w:val="single" w:color="C9D1D6" w:sz="4"/>
-            </w:tcBorders>
-            <w:shd w:fill="F1F4F6" w:color="auto" w:val="clear"/>
-            <w:tcMar>
-              <w:top w:type="dxa" w:w="60"/>
-              <w:left w:type="dxa" w:w="100"/>
-              <w:bottom w:type="dxa" w:w="60"/>
-              <w:right w:type="dxa" w:w="100"/>
-            </w:tcMar>
-          </w:tcPr>
-          <w:p>
-            <w:r>
-              <w:rPr>
-                <w:rFonts w:ascii="Calibri" w:cs="Calibri" w:eastAsia="Calibri" w:hAnsi="Calibri"/>
-                <w:color w:val="333F48"/>
-                <w:sz w:val="19"/>
-                <w:szCs w:val="19"/>
-              </w:rPr>
-              <w:t xml:space="preserve">☐</w:t>
-            </w:r>
-          </w:p>
-        </w:tc>
-        <w:tc>
-          <w:tcPr>
-            <w:tcW w:type="dxa" w:w="8738"/>
-            <w:tcBorders>
-              <w:top w:val="single" w:color="C9D1D6" w:sz="4"/>
-              <w:left w:val="single" w:color="C9D1D6" w:sz="4"/>
-              <w:bottom w:val="single" w:color="C9D1D6" w:sz="4"/>
-              <w:right w:val="single" w:color="C9D1D6" w:sz="4"/>
-            </w:tcBorders>
-            <w:shd w:fill="F1F4F6" w:color="auto" w:val="clear"/>
-            <w:tcMar>
-              <w:top w:type="dxa" w:w="60"/>
-              <w:left w:type="dxa" w:w="100"/>
-              <w:bottom w:type="dxa" w:w="60"/>
-              <w:right w:type="dxa" w:w="100"/>
-            </w:tcMar>
-          </w:tcPr>
-          <w:p>
-            <w:r>
-              <w:rPr>
-                <w:rFonts w:ascii="Calibri" w:cs="Calibri" w:eastAsia="Calibri" w:hAnsi="Calibri"/>
-                <w:color w:val="333F48"/>
-                <w:sz w:val="19"/>
-                <w:szCs w:val="19"/>
-              </w:rPr>
-              <w:t xml:space="preserve">Both mock self-tests pass, and the insurer answers in 6.2.</w:t>
-            </w:r>
-          </w:p>
-        </w:tc>
-      </w:tr>
-      <w:tr>
-        <w:trPr>
-          <w:tblHeader w:val="false"/>
-        </w:trPr>
-        <w:tc>
-          <w:tcPr>
-            <w:tcW w:type="dxa" w:w="900"/>
-            <w:tcBorders>
-              <w:top w:val="single" w:color="C9D1D6" w:sz="4"/>
-              <w:left w:val="single" w:color="C9D1D6" w:sz="4"/>
-              <w:bottom w:val="single" w:color="C9D1D6" w:sz="4"/>
-              <w:right w:val="single" w:color="C9D1D6" w:sz="4"/>
-            </w:tcBorders>
-            <w:shd w:fill="FFFFFF" w:color="auto" w:val="clear"/>
-            <w:tcMar>
-              <w:top w:type="dxa" w:w="60"/>
-              <w:left w:type="dxa" w:w="100"/>
-              <w:bottom w:type="dxa" w:w="60"/>
-              <w:right w:type="dxa" w:w="100"/>
-            </w:tcMar>
-          </w:tcPr>
-          <w:p>
-            <w:r>
-              <w:rPr>
-                <w:rFonts w:ascii="Calibri" w:cs="Calibri" w:eastAsia="Calibri" w:hAnsi="Calibri"/>
-                <w:color w:val="333F48"/>
-                <w:sz w:val="19"/>
-                <w:szCs w:val="19"/>
-              </w:rPr>
-              <w:t xml:space="preserve">☐</w:t>
-            </w:r>
-          </w:p>
-        </w:tc>
-        <w:tc>
-          <w:tcPr>
-            <w:tcW w:type="dxa" w:w="8738"/>
-            <w:tcBorders>
-              <w:top w:val="single" w:color="C9D1D6" w:sz="4"/>
-              <w:left w:val="single" w:color="C9D1D6" w:sz="4"/>
-              <w:bottom w:val="single" w:color="C9D1D6" w:sz="4"/>
-              <w:right w:val="single" w:color="C9D1D6" w:sz="4"/>
-            </w:tcBorders>
-            <w:shd w:fill="FFFFFF" w:color="auto" w:val="clear"/>
-            <w:tcMar>
-              <w:top w:type="dxa" w:w="60"/>
-              <w:left w:type="dxa" w:w="100"/>
-              <w:bottom w:type="dxa" w:w="60"/>
-              <w:right w:type="dxa" w:w="100"/>
-            </w:tcMar>
-          </w:tcPr>
-          <w:p>
-            <w:r>
-              <w:rPr>
-                <w:rFonts w:ascii="Calibri" w:cs="Calibri" w:eastAsia="Calibri" w:hAnsi="Calibri"/>
-                <w:color w:val="333F48"/>
-                <w:sz w:val="19"/>
-                <w:szCs w:val="19"/>
-              </w:rPr>
-              <w:t xml:space="preserve">VS Code shows </w:t>
-            </w:r>
-            <w:r>
-              <w:rPr>
-                <w:rFonts w:ascii="Consolas" w:cs="Consolas" w:eastAsia="Consolas" w:hAnsi="Consolas"/>
-                <w:color w:val="6B2C91"/>
-                <w:sz w:val="17"/>
-                <w:szCs w:val="17"/>
-              </w:rPr>
-              <w:t xml:space="preserve">Insurligent.Setup</w:t>
-            </w:r>
-            <w:r>
-              <w:rPr>
-                <w:rFonts w:ascii="Calibri" w:cs="Calibri" w:eastAsia="Calibri" w:hAnsi="Calibri"/>
-                <w:color w:val="333F48"/>
-                <w:sz w:val="19"/>
-                <w:szCs w:val="19"/>
-              </w:rPr>
-              <w:t xml:space="preserve"> in the InterSystems Explorer view, and the empty folders under </w:t>
-            </w:r>
-            <w:r>
-              <w:rPr>
-                <w:rFonts w:ascii="Consolas" w:cs="Consolas" w:eastAsia="Consolas" w:hAnsi="Consolas"/>
-                <w:color w:val="6B2C91"/>
-                <w:sz w:val="17"/>
-                <w:szCs w:val="17"/>
-              </w:rPr>
-              <w:t xml:space="preserve">src/Insurligent</w:t>
-            </w:r>
-            <w:r>
-              <w:rPr>
-                <w:rFonts w:ascii="Calibri" w:cs="Calibri" w:eastAsia="Calibri" w:hAnsi="Calibri"/>
-                <w:color w:val="333F48"/>
-                <w:sz w:val="19"/>
-                <w:szCs w:val="19"/>
-              </w:rPr>
-              <w:t xml:space="preserve">.</w:t>
             </w:r>
           </w:p>
         </w:tc>

</xml_diff>

<commit_message>
docs: final lab handout; REST Client requests for Part F
- Lab handout: the reviewed version. Test button first in Part B, DTL
  tests (D3, D5), notes on PokeDocType and on (1) in HL7 paths, the
  full E2 table with synchronous calls, and Part F with REST Client.
- Worksheet: install the REST Client extension of VS Code (4.1).
- http/PreAuthInfo.http: the four end-to-end requests of Part F5.
- .vscode/extensions.json: recommends the ObjectScript pack and REST
  Client.
- Answer key: InsuredPersonInfo also extends %XML.Adaptor.

src/ keeps only the empty package folders: the start state of the lab.

Co-Authored-By: Claude Opus 5.5 (1M context) <noreply@anthropic.com>
</commit_message>
<xml_diff>
--- a/docs/Environment_Setup_Worksheet.docx
+++ b/docs/Environment_Setup_Worksheet.docx
@@ -520,7 +520,7 @@
                 <w:sz w:val="19"/>
                 <w:szCs w:val="19"/>
               </w:rPr>
-              <w:t xml:space="preserve">A REST client, for example Postman</w:t>
+              <w:t xml:space="preserve">A REST client: the REST Client extension of VS Code (4.1), or Postman</w:t>
             </w:r>
           </w:p>
         </w:tc>
@@ -1180,7 +1180,345 @@
           <w:sz w:val="21"/>
           <w:szCs w:val="21"/>
         </w:rPr>
-        <w:t xml:space="preserve"> In VS Code, install the InterSystems ObjectScript Extension Pack. It lets you edit IRIS classes and compile them on the server.</w:t>
+        <w:t xml:space="preserve"> In VS Code, open the Extensions view and install these two extensions:</w:t>
+      </w:r>
+    </w:p>
+    <w:tbl>
+      <w:tblPr>
+        <w:tblW w:type="dxa" w:w="9638"/>
+        <w:tblBorders>
+          <w:top w:val="single" w:color="auto" w:sz="4"/>
+          <w:left w:val="single" w:color="auto" w:sz="4"/>
+          <w:bottom w:val="single" w:color="auto" w:sz="4"/>
+          <w:right w:val="single" w:color="auto" w:sz="4"/>
+          <w:insideH w:val="single" w:color="auto" w:sz="4"/>
+          <w:insideV w:val="single" w:color="auto" w:sz="4"/>
+        </w:tblBorders>
+        <w:tblLayout w:type="fixed"/>
+      </w:tblPr>
+      <w:tblGrid>
+        <w:gridCol w:w="3200"/>
+        <w:gridCol w:w="3600"/>
+        <w:gridCol w:w="2838"/>
+      </w:tblGrid>
+      <w:tr>
+        <w:trPr>
+          <w:tblHeader/>
+        </w:trPr>
+        <w:tc>
+          <w:tcPr>
+            <w:tcW w:type="dxa" w:w="3200"/>
+            <w:tcBorders>
+              <w:top w:val="single" w:color="C9D1D6" w:sz="4"/>
+              <w:left w:val="single" w:color="C9D1D6" w:sz="4"/>
+              <w:bottom w:val="single" w:color="C9D1D6" w:sz="4"/>
+              <w:right w:val="single" w:color="C9D1D6" w:sz="4"/>
+            </w:tcBorders>
+            <w:shd w:fill="00A99D" w:color="auto" w:val="clear"/>
+            <w:tcMar>
+              <w:top w:type="dxa" w:w="60"/>
+              <w:left w:type="dxa" w:w="100"/>
+              <w:bottom w:type="dxa" w:w="60"/>
+              <w:right w:type="dxa" w:w="100"/>
+            </w:tcMar>
+          </w:tcPr>
+          <w:p>
+            <w:r>
+              <w:rPr>
+                <w:rFonts w:ascii="Calibri" w:cs="Calibri" w:eastAsia="Calibri" w:hAnsi="Calibri"/>
+                <w:b/>
+                <w:bCs/>
+                <w:color w:val="FFFFFF"/>
+                <w:sz w:val="19"/>
+                <w:szCs w:val="19"/>
+              </w:rPr>
+              <w:t xml:space="preserve">Extension</w:t>
+            </w:r>
+          </w:p>
+        </w:tc>
+        <w:tc>
+          <w:tcPr>
+            <w:tcW w:type="dxa" w:w="3600"/>
+            <w:tcBorders>
+              <w:top w:val="single" w:color="C9D1D6" w:sz="4"/>
+              <w:left w:val="single" w:color="C9D1D6" w:sz="4"/>
+              <w:bottom w:val="single" w:color="C9D1D6" w:sz="4"/>
+              <w:right w:val="single" w:color="C9D1D6" w:sz="4"/>
+            </w:tcBorders>
+            <w:shd w:fill="00A99D" w:color="auto" w:val="clear"/>
+            <w:tcMar>
+              <w:top w:type="dxa" w:w="60"/>
+              <w:left w:type="dxa" w:w="100"/>
+              <w:bottom w:type="dxa" w:w="60"/>
+              <w:right w:type="dxa" w:w="100"/>
+            </w:tcMar>
+          </w:tcPr>
+          <w:p>
+            <w:r>
+              <w:rPr>
+                <w:rFonts w:ascii="Calibri" w:cs="Calibri" w:eastAsia="Calibri" w:hAnsi="Calibri"/>
+                <w:b/>
+                <w:bCs/>
+                <w:color w:val="FFFFFF"/>
+                <w:sz w:val="19"/>
+                <w:szCs w:val="19"/>
+              </w:rPr>
+              <w:t xml:space="preserve">ID</w:t>
+            </w:r>
+          </w:p>
+        </w:tc>
+        <w:tc>
+          <w:tcPr>
+            <w:tcW w:type="dxa" w:w="2838"/>
+            <w:tcBorders>
+              <w:top w:val="single" w:color="C9D1D6" w:sz="4"/>
+              <w:left w:val="single" w:color="C9D1D6" w:sz="4"/>
+              <w:bottom w:val="single" w:color="C9D1D6" w:sz="4"/>
+              <w:right w:val="single" w:color="C9D1D6" w:sz="4"/>
+            </w:tcBorders>
+            <w:shd w:fill="00A99D" w:color="auto" w:val="clear"/>
+            <w:tcMar>
+              <w:top w:type="dxa" w:w="60"/>
+              <w:left w:type="dxa" w:w="100"/>
+              <w:bottom w:type="dxa" w:w="60"/>
+              <w:right w:type="dxa" w:w="100"/>
+            </w:tcMar>
+          </w:tcPr>
+          <w:p>
+            <w:r>
+              <w:rPr>
+                <w:rFonts w:ascii="Calibri" w:cs="Calibri" w:eastAsia="Calibri" w:hAnsi="Calibri"/>
+                <w:b/>
+                <w:bCs/>
+                <w:color w:val="FFFFFF"/>
+                <w:sz w:val="19"/>
+                <w:szCs w:val="19"/>
+              </w:rPr>
+              <w:t xml:space="preserve">Why</w:t>
+            </w:r>
+          </w:p>
+        </w:tc>
+      </w:tr>
+      <w:tr>
+        <w:trPr>
+          <w:tblHeader w:val="false"/>
+        </w:trPr>
+        <w:tc>
+          <w:tcPr>
+            <w:tcW w:type="dxa" w:w="3200"/>
+            <w:tcBorders>
+              <w:top w:val="single" w:color="C9D1D6" w:sz="4"/>
+              <w:left w:val="single" w:color="C9D1D6" w:sz="4"/>
+              <w:bottom w:val="single" w:color="C9D1D6" w:sz="4"/>
+              <w:right w:val="single" w:color="C9D1D6" w:sz="4"/>
+            </w:tcBorders>
+            <w:shd w:fill="FFFFFF" w:color="auto" w:val="clear"/>
+            <w:tcMar>
+              <w:top w:type="dxa" w:w="60"/>
+              <w:left w:type="dxa" w:w="100"/>
+              <w:bottom w:type="dxa" w:w="60"/>
+              <w:right w:type="dxa" w:w="100"/>
+            </w:tcMar>
+          </w:tcPr>
+          <w:p>
+            <w:r>
+              <w:rPr>
+                <w:rFonts w:ascii="Calibri" w:cs="Calibri" w:eastAsia="Calibri" w:hAnsi="Calibri"/>
+                <w:color w:val="333F48"/>
+                <w:sz w:val="19"/>
+                <w:szCs w:val="19"/>
+              </w:rPr>
+              <w:t xml:space="preserve">InterSystems ObjectScript Extension Pack</w:t>
+            </w:r>
+          </w:p>
+        </w:tc>
+        <w:tc>
+          <w:tcPr>
+            <w:tcW w:type="dxa" w:w="3600"/>
+            <w:tcBorders>
+              <w:top w:val="single" w:color="C9D1D6" w:sz="4"/>
+              <w:left w:val="single" w:color="C9D1D6" w:sz="4"/>
+              <w:bottom w:val="single" w:color="C9D1D6" w:sz="4"/>
+              <w:right w:val="single" w:color="C9D1D6" w:sz="4"/>
+            </w:tcBorders>
+            <w:shd w:fill="FFFFFF" w:color="auto" w:val="clear"/>
+            <w:tcMar>
+              <w:top w:type="dxa" w:w="60"/>
+              <w:left w:type="dxa" w:w="100"/>
+              <w:bottom w:type="dxa" w:w="60"/>
+              <w:right w:type="dxa" w:w="100"/>
+            </w:tcMar>
+          </w:tcPr>
+          <w:p>
+            <w:r>
+              <w:rPr>
+                <w:rFonts w:ascii="Consolas" w:cs="Consolas" w:eastAsia="Consolas" w:hAnsi="Consolas"/>
+                <w:color w:val="6B2C91"/>
+                <w:sz w:val="17"/>
+                <w:szCs w:val="17"/>
+              </w:rPr>
+              <w:t xml:space="preserve">intersystems-community.objectscript-pack</w:t>
+            </w:r>
+          </w:p>
+        </w:tc>
+        <w:tc>
+          <w:tcPr>
+            <w:tcW w:type="dxa" w:w="2838"/>
+            <w:tcBorders>
+              <w:top w:val="single" w:color="C9D1D6" w:sz="4"/>
+              <w:left w:val="single" w:color="C9D1D6" w:sz="4"/>
+              <w:bottom w:val="single" w:color="C9D1D6" w:sz="4"/>
+              <w:right w:val="single" w:color="C9D1D6" w:sz="4"/>
+            </w:tcBorders>
+            <w:shd w:fill="FFFFFF" w:color="auto" w:val="clear"/>
+            <w:tcMar>
+              <w:top w:type="dxa" w:w="60"/>
+              <w:left w:type="dxa" w:w="100"/>
+              <w:bottom w:type="dxa" w:w="60"/>
+              <w:right w:type="dxa" w:w="100"/>
+            </w:tcMar>
+          </w:tcPr>
+          <w:p>
+            <w:r>
+              <w:rPr>
+                <w:rFonts w:ascii="Calibri" w:cs="Calibri" w:eastAsia="Calibri" w:hAnsi="Calibri"/>
+                <w:color w:val="333F48"/>
+                <w:sz w:val="19"/>
+                <w:szCs w:val="19"/>
+              </w:rPr>
+              <w:t xml:space="preserve">Edit IRIS classes and compile them on the server.</w:t>
+            </w:r>
+          </w:p>
+        </w:tc>
+      </w:tr>
+      <w:tr>
+        <w:trPr>
+          <w:tblHeader w:val="false"/>
+        </w:trPr>
+        <w:tc>
+          <w:tcPr>
+            <w:tcW w:type="dxa" w:w="3200"/>
+            <w:tcBorders>
+              <w:top w:val="single" w:color="C9D1D6" w:sz="4"/>
+              <w:left w:val="single" w:color="C9D1D6" w:sz="4"/>
+              <w:bottom w:val="single" w:color="C9D1D6" w:sz="4"/>
+              <w:right w:val="single" w:color="C9D1D6" w:sz="4"/>
+            </w:tcBorders>
+            <w:shd w:fill="F1F4F6" w:color="auto" w:val="clear"/>
+            <w:tcMar>
+              <w:top w:type="dxa" w:w="60"/>
+              <w:left w:type="dxa" w:w="100"/>
+              <w:bottom w:type="dxa" w:w="60"/>
+              <w:right w:type="dxa" w:w="100"/>
+            </w:tcMar>
+          </w:tcPr>
+          <w:p>
+            <w:r>
+              <w:rPr>
+                <w:rFonts w:ascii="Calibri" w:cs="Calibri" w:eastAsia="Calibri" w:hAnsi="Calibri"/>
+                <w:color w:val="333F48"/>
+                <w:sz w:val="19"/>
+                <w:szCs w:val="19"/>
+              </w:rPr>
+              <w:t xml:space="preserve">REST Client (Huachao Mao)</w:t>
+            </w:r>
+          </w:p>
+        </w:tc>
+        <w:tc>
+          <w:tcPr>
+            <w:tcW w:type="dxa" w:w="3600"/>
+            <w:tcBorders>
+              <w:top w:val="single" w:color="C9D1D6" w:sz="4"/>
+              <w:left w:val="single" w:color="C9D1D6" w:sz="4"/>
+              <w:bottom w:val="single" w:color="C9D1D6" w:sz="4"/>
+              <w:right w:val="single" w:color="C9D1D6" w:sz="4"/>
+            </w:tcBorders>
+            <w:shd w:fill="F1F4F6" w:color="auto" w:val="clear"/>
+            <w:tcMar>
+              <w:top w:type="dxa" w:w="60"/>
+              <w:left w:type="dxa" w:w="100"/>
+              <w:bottom w:type="dxa" w:w="60"/>
+              <w:right w:type="dxa" w:w="100"/>
+            </w:tcMar>
+          </w:tcPr>
+          <w:p>
+            <w:r>
+              <w:rPr>
+                <w:rFonts w:ascii="Consolas" w:cs="Consolas" w:eastAsia="Consolas" w:hAnsi="Consolas"/>
+                <w:color w:val="6B2C91"/>
+                <w:sz w:val="17"/>
+                <w:szCs w:val="17"/>
+              </w:rPr>
+              <w:t xml:space="preserve">humao.rest-client</w:t>
+            </w:r>
+          </w:p>
+        </w:tc>
+        <w:tc>
+          <w:tcPr>
+            <w:tcW w:type="dxa" w:w="2838"/>
+            <w:tcBorders>
+              <w:top w:val="single" w:color="C9D1D6" w:sz="4"/>
+              <w:left w:val="single" w:color="C9D1D6" w:sz="4"/>
+              <w:bottom w:val="single" w:color="C9D1D6" w:sz="4"/>
+              <w:right w:val="single" w:color="C9D1D6" w:sz="4"/>
+            </w:tcBorders>
+            <w:shd w:fill="F1F4F6" w:color="auto" w:val="clear"/>
+            <w:tcMar>
+              <w:top w:type="dxa" w:w="60"/>
+              <w:left w:type="dxa" w:w="100"/>
+              <w:bottom w:type="dxa" w:w="60"/>
+              <w:right w:type="dxa" w:w="100"/>
+            </w:tcMar>
+          </w:tcPr>
+          <w:p>
+            <w:r>
+              <w:rPr>
+                <w:rFonts w:ascii="Calibri" w:cs="Calibri" w:eastAsia="Calibri" w:hAnsi="Calibri"/>
+                <w:color w:val="333F48"/>
+                <w:sz w:val="19"/>
+                <w:szCs w:val="19"/>
+              </w:rPr>
+              <w:t xml:space="preserve">Send the test requests of Part F of the lab, from </w:t>
+            </w:r>
+            <w:r>
+              <w:rPr>
+                <w:rFonts w:ascii="Consolas" w:cs="Consolas" w:eastAsia="Consolas" w:hAnsi="Consolas"/>
+                <w:color w:val="6B2C91"/>
+                <w:sz w:val="17"/>
+                <w:szCs w:val="17"/>
+              </w:rPr>
+              <w:t xml:space="preserve">http/PreAuthInfo.http</w:t>
+            </w:r>
+            <w:r>
+              <w:rPr>
+                <w:rFonts w:ascii="Calibri" w:cs="Calibri" w:eastAsia="Calibri" w:hAnsi="Calibri"/>
+                <w:color w:val="333F48"/>
+                <w:sz w:val="19"/>
+                <w:szCs w:val="19"/>
+              </w:rPr>
+              <w:t xml:space="preserve">.</w:t>
+            </w:r>
+          </w:p>
+        </w:tc>
+      </w:tr>
+    </w:tbl>
+    <w:p>
+      <w:pPr>
+        <w:spacing w:after="60"/>
+      </w:pPr>
+    </w:p>
+    <w:p>
+      <w:pPr>
+        <w:spacing w:after="120"/>
+      </w:pPr>
+      <w:r>
+        <w:rPr>
+          <w:rFonts w:ascii="Calibri" w:cs="Calibri" w:eastAsia="Calibri" w:hAnsi="Calibri"/>
+          <w:color w:val="333F48"/>
+          <w:sz w:val="21"/>
+          <w:szCs w:val="21"/>
+        </w:rPr>
+        <w:t xml:space="preserve">When you open the lab folder (4.2), VS Code also recommends these two extensions.</w:t>
       </w:r>
     </w:p>
     <w:p>

</xml_diff>